<commit_message>
recoded HH income and food security vars
</commit_message>
<xml_diff>
--- a/Code/Table1_Combined.docx
+++ b/Code/Table1_Combined.docx
@@ -2533,199 +2533,199 @@
                 <w:rFonts w:ascii="Calibri" w:hAnsi="Calibri"/>
                 <w:sz w:val="20"/>
               </w:rPr>
-              <w:t xml:space="default">    Low Income (&lt; 130% PIR)</w:t>
-            </w:r>
-          </w:p>
-        </w:tc>
-        <w:tc>
-          <w:tcPr>
-            <w:tcBorders>
-              <w:top w:val="single" w:space="0" w:color="D3D3D3"/>
-              <w:bottom w:val="single" w:space="0" w:color="D3D3D3"/>
-              <w:start w:val="single" w:space="0" w:color="D3D3D3"/>
-              <w:end w:val="single" w:space="0" w:color="D3D3D3"/>
-            </w:tcBorders>
-          </w:tcPr>
-          <w:p>
-            <w:pPr>
-              <w:spacing w:before="0" w:after="60"/>
-              <w:keepNext/>
-              <w:jc w:val="center"/>
-            </w:pPr>
-            <w:r>
-              <w:rPr>
-                <w:rFonts w:ascii="Calibri" w:hAnsi="Calibri"/>
-                <w:sz w:val="20"/>
-              </w:rPr>
-              <w:t xml:space="default">159 (23%)</w:t>
-            </w:r>
-          </w:p>
-        </w:tc>
-        <w:tc>
-          <w:tcPr>
-            <w:tcBorders>
-              <w:top w:val="single" w:space="0" w:color="D3D3D3"/>
-              <w:bottom w:val="single" w:space="0" w:color="D3D3D3"/>
-              <w:start w:val="single" w:space="0" w:color="D3D3D3"/>
-              <w:end w:val="single" w:space="0" w:color="D3D3D3"/>
-            </w:tcBorders>
-          </w:tcPr>
-          <w:p>
-            <w:pPr>
-              <w:spacing w:before="0" w:after="60"/>
-              <w:keepNext/>
-              <w:jc w:val="center"/>
-            </w:pPr>
-            <w:r>
-              <w:rPr>
-                <w:rFonts w:ascii="Calibri" w:hAnsi="Calibri"/>
-                <w:sz w:val="20"/>
-              </w:rPr>
-              <w:t xml:space="default">221 (29%)</w:t>
-            </w:r>
-          </w:p>
-        </w:tc>
-        <w:tc>
-          <w:tcPr>
-            <w:tcBorders>
-              <w:top w:val="single" w:space="0" w:color="D3D3D3"/>
-              <w:bottom w:val="single" w:space="0" w:color="D3D3D3"/>
-              <w:start w:val="single" w:space="0" w:color="D3D3D3"/>
-              <w:end w:val="single" w:space="0" w:color="D3D3D3"/>
-            </w:tcBorders>
-          </w:tcPr>
-          <w:p>
-            <w:pPr>
-              <w:spacing w:before="0" w:after="60"/>
-              <w:keepNext/>
-              <w:jc w:val="center"/>
-            </w:pPr>
-            <w:r>
-              <w:rPr>
-                <w:rFonts w:ascii="Calibri" w:hAnsi="Calibri"/>
-                <w:sz w:val="20"/>
-              </w:rPr>
-              <w:t xml:space="default">263 (32%)</w:t>
-            </w:r>
-          </w:p>
-        </w:tc>
-        <w:tc>
-          <w:tcPr>
-            <w:tcBorders>
-              <w:top w:val="single" w:space="0" w:color="D3D3D3"/>
-              <w:bottom w:val="single" w:space="0" w:color="D3D3D3"/>
-              <w:start w:val="single" w:space="0" w:color="D3D3D3"/>
-              <w:end w:val="single" w:space="0" w:color="D3D3D3"/>
-            </w:tcBorders>
-          </w:tcPr>
-          <w:p>
-            <w:pPr>
-              <w:spacing w:before="0" w:after="60"/>
-              <w:keepNext/>
-              <w:jc w:val="center"/>
-            </w:pPr>
-            <w:r>
-              <w:rPr>
-                <w:rFonts w:ascii="Calibri" w:hAnsi="Calibri"/>
-                <w:sz w:val="20"/>
-              </w:rPr>
-              <w:t xml:space="default">195 (37%)</w:t>
-            </w:r>
-          </w:p>
-        </w:tc>
-        <w:tc>
-          <w:tcPr>
-            <w:tcBorders>
-              <w:top w:val="single" w:space="0" w:color="D3D3D3"/>
-              <w:bottom w:val="single" w:space="0" w:color="D3D3D3"/>
-              <w:start w:val="single" w:space="0" w:color="D3D3D3"/>
-              <w:end w:val="single" w:space="0" w:color="D3D3D3"/>
-            </w:tcBorders>
-          </w:tcPr>
-          <w:p>
-            <w:pPr>
-              <w:spacing w:before="0" w:after="60"/>
-              <w:keepNext/>
-              <w:jc w:val="center"/>
-            </w:pPr>
-            <w:r>
-              <w:rPr>
-                <w:rFonts w:ascii="Calibri" w:hAnsi="Calibri"/>
-                <w:sz w:val="20"/>
-              </w:rPr>
-              <w:t xml:space="default">188 (24%)</w:t>
-            </w:r>
-          </w:p>
-        </w:tc>
-        <w:tc>
-          <w:tcPr>
-            <w:tcBorders>
-              <w:top w:val="single" w:space="0" w:color="D3D3D3"/>
-              <w:bottom w:val="single" w:space="0" w:color="D3D3D3"/>
-              <w:start w:val="single" w:space="0" w:color="D3D3D3"/>
-              <w:end w:val="single" w:space="0" w:color="D3D3D3"/>
-            </w:tcBorders>
-          </w:tcPr>
-          <w:p>
-            <w:pPr>
-              <w:spacing w:before="0" w:after="60"/>
-              <w:keepNext/>
-              <w:jc w:val="center"/>
-            </w:pPr>
-            <w:r>
-              <w:rPr>
-                <w:rFonts w:ascii="Calibri" w:hAnsi="Calibri"/>
-                <w:sz w:val="20"/>
-              </w:rPr>
-              <w:t xml:space="default">191 (29%)</w:t>
-            </w:r>
-          </w:p>
-        </w:tc>
-        <w:tc>
-          <w:tcPr>
-            <w:tcBorders>
-              <w:top w:val="single" w:space="0" w:color="D3D3D3"/>
-              <w:bottom w:val="single" w:space="0" w:color="D3D3D3"/>
-              <w:start w:val="single" w:space="0" w:color="D3D3D3"/>
-              <w:end w:val="single" w:space="0" w:color="D3D3D3"/>
-            </w:tcBorders>
-          </w:tcPr>
-          <w:p>
-            <w:pPr>
-              <w:spacing w:before="0" w:after="60"/>
-              <w:keepNext/>
-              <w:jc w:val="center"/>
-            </w:pPr>
-            <w:r>
-              <w:rPr>
-                <w:rFonts w:ascii="Calibri" w:hAnsi="Calibri"/>
-                <w:sz w:val="20"/>
-              </w:rPr>
-              <w:t xml:space="default">245 (31%)</w:t>
-            </w:r>
-          </w:p>
-        </w:tc>
-        <w:tc>
-          <w:tcPr>
-            <w:tcBorders>
-              <w:top w:val="single" w:space="0" w:color="D3D3D3"/>
-              <w:bottom w:val="single" w:space="0" w:color="D3D3D3"/>
-              <w:start w:val="single" w:space="0" w:color="D3D3D3"/>
-              <w:end w:val="single" w:space="0" w:color="D3D3D3"/>
-            </w:tcBorders>
-          </w:tcPr>
-          <w:p>
-            <w:pPr>
-              <w:spacing w:before="0" w:after="60"/>
-              <w:keepNext/>
-              <w:jc w:val="center"/>
-            </w:pPr>
-            <w:r>
-              <w:rPr>
-                <w:rFonts w:ascii="Calibri" w:hAnsi="Calibri"/>
-                <w:sz w:val="20"/>
-              </w:rPr>
-              <w:t xml:space="default">219 (41%)</w:t>
+              <w:t xml:space="default">    Poverty (&lt; 100% PIR)</w:t>
+            </w:r>
+          </w:p>
+        </w:tc>
+        <w:tc>
+          <w:tcPr>
+            <w:tcBorders>
+              <w:top w:val="single" w:space="0" w:color="D3D3D3"/>
+              <w:bottom w:val="single" w:space="0" w:color="D3D3D3"/>
+              <w:start w:val="single" w:space="0" w:color="D3D3D3"/>
+              <w:end w:val="single" w:space="0" w:color="D3D3D3"/>
+            </w:tcBorders>
+          </w:tcPr>
+          <w:p>
+            <w:pPr>
+              <w:spacing w:before="0" w:after="60"/>
+              <w:keepNext/>
+              <w:jc w:val="center"/>
+            </w:pPr>
+            <w:r>
+              <w:rPr>
+                <w:rFonts w:ascii="Calibri" w:hAnsi="Calibri"/>
+                <w:sz w:val="20"/>
+              </w:rPr>
+              <w:t xml:space="default">114 (16%)</w:t>
+            </w:r>
+          </w:p>
+        </w:tc>
+        <w:tc>
+          <w:tcPr>
+            <w:tcBorders>
+              <w:top w:val="single" w:space="0" w:color="D3D3D3"/>
+              <w:bottom w:val="single" w:space="0" w:color="D3D3D3"/>
+              <w:start w:val="single" w:space="0" w:color="D3D3D3"/>
+              <w:end w:val="single" w:space="0" w:color="D3D3D3"/>
+            </w:tcBorders>
+          </w:tcPr>
+          <w:p>
+            <w:pPr>
+              <w:spacing w:before="0" w:after="60"/>
+              <w:keepNext/>
+              <w:jc w:val="center"/>
+            </w:pPr>
+            <w:r>
+              <w:rPr>
+                <w:rFonts w:ascii="Calibri" w:hAnsi="Calibri"/>
+                <w:sz w:val="20"/>
+              </w:rPr>
+              <w:t xml:space="default">168 (21%)</w:t>
+            </w:r>
+          </w:p>
+        </w:tc>
+        <w:tc>
+          <w:tcPr>
+            <w:tcBorders>
+              <w:top w:val="single" w:space="0" w:color="D3D3D3"/>
+              <w:bottom w:val="single" w:space="0" w:color="D3D3D3"/>
+              <w:start w:val="single" w:space="0" w:color="D3D3D3"/>
+              <w:end w:val="single" w:space="0" w:color="D3D3D3"/>
+            </w:tcBorders>
+          </w:tcPr>
+          <w:p>
+            <w:pPr>
+              <w:spacing w:before="0" w:after="60"/>
+              <w:keepNext/>
+              <w:jc w:val="center"/>
+            </w:pPr>
+            <w:r>
+              <w:rPr>
+                <w:rFonts w:ascii="Calibri" w:hAnsi="Calibri"/>
+                <w:sz w:val="20"/>
+              </w:rPr>
+              <w:t xml:space="default">182 (21%)</w:t>
+            </w:r>
+          </w:p>
+        </w:tc>
+        <w:tc>
+          <w:tcPr>
+            <w:tcBorders>
+              <w:top w:val="single" w:space="0" w:color="D3D3D3"/>
+              <w:bottom w:val="single" w:space="0" w:color="D3D3D3"/>
+              <w:start w:val="single" w:space="0" w:color="D3D3D3"/>
+              <w:end w:val="single" w:space="0" w:color="D3D3D3"/>
+            </w:tcBorders>
+          </w:tcPr>
+          <w:p>
+            <w:pPr>
+              <w:spacing w:before="0" w:after="60"/>
+              <w:keepNext/>
+              <w:jc w:val="center"/>
+            </w:pPr>
+            <w:r>
+              <w:rPr>
+                <w:rFonts w:ascii="Calibri" w:hAnsi="Calibri"/>
+                <w:sz w:val="20"/>
+              </w:rPr>
+              <w:t xml:space="default">138 (24%)</w:t>
+            </w:r>
+          </w:p>
+        </w:tc>
+        <w:tc>
+          <w:tcPr>
+            <w:tcBorders>
+              <w:top w:val="single" w:space="0" w:color="D3D3D3"/>
+              <w:bottom w:val="single" w:space="0" w:color="D3D3D3"/>
+              <w:start w:val="single" w:space="0" w:color="D3D3D3"/>
+              <w:end w:val="single" w:space="0" w:color="D3D3D3"/>
+            </w:tcBorders>
+          </w:tcPr>
+          <w:p>
+            <w:pPr>
+              <w:spacing w:before="0" w:after="60"/>
+              <w:keepNext/>
+              <w:jc w:val="center"/>
+            </w:pPr>
+            <w:r>
+              <w:rPr>
+                <w:rFonts w:ascii="Calibri" w:hAnsi="Calibri"/>
+                <w:sz w:val="20"/>
+              </w:rPr>
+              <w:t xml:space="default">144 (19%)</w:t>
+            </w:r>
+          </w:p>
+        </w:tc>
+        <w:tc>
+          <w:tcPr>
+            <w:tcBorders>
+              <w:top w:val="single" w:space="0" w:color="D3D3D3"/>
+              <w:bottom w:val="single" w:space="0" w:color="D3D3D3"/>
+              <w:start w:val="single" w:space="0" w:color="D3D3D3"/>
+              <w:end w:val="single" w:space="0" w:color="D3D3D3"/>
+            </w:tcBorders>
+          </w:tcPr>
+          <w:p>
+            <w:pPr>
+              <w:spacing w:before="0" w:after="60"/>
+              <w:keepNext/>
+              <w:jc w:val="center"/>
+            </w:pPr>
+            <w:r>
+              <w:rPr>
+                <w:rFonts w:ascii="Calibri" w:hAnsi="Calibri"/>
+                <w:sz w:val="20"/>
+              </w:rPr>
+              <w:t xml:space="default">130 (21%)</w:t>
+            </w:r>
+          </w:p>
+        </w:tc>
+        <w:tc>
+          <w:tcPr>
+            <w:tcBorders>
+              <w:top w:val="single" w:space="0" w:color="D3D3D3"/>
+              <w:bottom w:val="single" w:space="0" w:color="D3D3D3"/>
+              <w:start w:val="single" w:space="0" w:color="D3D3D3"/>
+              <w:end w:val="single" w:space="0" w:color="D3D3D3"/>
+            </w:tcBorders>
+          </w:tcPr>
+          <w:p>
+            <w:pPr>
+              <w:spacing w:before="0" w:after="60"/>
+              <w:keepNext/>
+              <w:jc w:val="center"/>
+            </w:pPr>
+            <w:r>
+              <w:rPr>
+                <w:rFonts w:ascii="Calibri" w:hAnsi="Calibri"/>
+                <w:sz w:val="20"/>
+              </w:rPr>
+              <w:t xml:space="default">167 (21%)</w:t>
+            </w:r>
+          </w:p>
+        </w:tc>
+        <w:tc>
+          <w:tcPr>
+            <w:tcBorders>
+              <w:top w:val="single" w:space="0" w:color="D3D3D3"/>
+              <w:bottom w:val="single" w:space="0" w:color="D3D3D3"/>
+              <w:start w:val="single" w:space="0" w:color="D3D3D3"/>
+              <w:end w:val="single" w:space="0" w:color="D3D3D3"/>
+            </w:tcBorders>
+          </w:tcPr>
+          <w:p>
+            <w:pPr>
+              <w:spacing w:before="0" w:after="60"/>
+              <w:keepNext/>
+              <w:jc w:val="center"/>
+            </w:pPr>
+            <w:r>
+              <w:rPr>
+                <w:rFonts w:ascii="Calibri" w:hAnsi="Calibri"/>
+                <w:sz w:val="20"/>
+              </w:rPr>
+              <w:t xml:space="default">158 (30%)</w:t>
             </w:r>
           </w:p>
         </w:tc>
@@ -2754,199 +2754,199 @@
                 <w:rFonts w:ascii="Calibri" w:hAnsi="Calibri"/>
                 <w:sz w:val="20"/>
               </w:rPr>
-              <w:t xml:space="default">    Middle Income (130-350% PIR)</w:t>
-            </w:r>
-          </w:p>
-        </w:tc>
-        <w:tc>
-          <w:tcPr>
-            <w:tcBorders>
-              <w:top w:val="single" w:space="0" w:color="D3D3D3"/>
-              <w:bottom w:val="single" w:space="0" w:color="D3D3D3"/>
-              <w:start w:val="single" w:space="0" w:color="D3D3D3"/>
-              <w:end w:val="single" w:space="0" w:color="D3D3D3"/>
-            </w:tcBorders>
-          </w:tcPr>
-          <w:p>
-            <w:pPr>
-              <w:spacing w:before="0" w:after="60"/>
-              <w:keepNext/>
-              <w:jc w:val="center"/>
-            </w:pPr>
-            <w:r>
-              <w:rPr>
-                <w:rFonts w:ascii="Calibri" w:hAnsi="Calibri"/>
-                <w:sz w:val="20"/>
-              </w:rPr>
-              <w:t xml:space="default">186 (44%)</w:t>
-            </w:r>
-          </w:p>
-        </w:tc>
-        <w:tc>
-          <w:tcPr>
-            <w:tcBorders>
-              <w:top w:val="single" w:space="0" w:color="D3D3D3"/>
-              <w:bottom w:val="single" w:space="0" w:color="D3D3D3"/>
-              <w:start w:val="single" w:space="0" w:color="D3D3D3"/>
-              <w:end w:val="single" w:space="0" w:color="D3D3D3"/>
-            </w:tcBorders>
-          </w:tcPr>
-          <w:p>
-            <w:pPr>
-              <w:spacing w:before="0" w:after="60"/>
-              <w:keepNext/>
-              <w:jc w:val="center"/>
-            </w:pPr>
-            <w:r>
-              <w:rPr>
-                <w:rFonts w:ascii="Calibri" w:hAnsi="Calibri"/>
-                <w:sz w:val="20"/>
-              </w:rPr>
-              <w:t xml:space="default">207 (36%)</w:t>
-            </w:r>
-          </w:p>
-        </w:tc>
-        <w:tc>
-          <w:tcPr>
-            <w:tcBorders>
-              <w:top w:val="single" w:space="0" w:color="D3D3D3"/>
-              <w:bottom w:val="single" w:space="0" w:color="D3D3D3"/>
-              <w:start w:val="single" w:space="0" w:color="D3D3D3"/>
-              <w:end w:val="single" w:space="0" w:color="D3D3D3"/>
-            </w:tcBorders>
-          </w:tcPr>
-          <w:p>
-            <w:pPr>
-              <w:spacing w:before="0" w:after="60"/>
-              <w:keepNext/>
-              <w:jc w:val="center"/>
-            </w:pPr>
-            <w:r>
-              <w:rPr>
-                <w:rFonts w:ascii="Calibri" w:hAnsi="Calibri"/>
-                <w:sz w:val="20"/>
-              </w:rPr>
-              <w:t xml:space="default">238 (41%)</w:t>
-            </w:r>
-          </w:p>
-        </w:tc>
-        <w:tc>
-          <w:tcPr>
-            <w:tcBorders>
-              <w:top w:val="single" w:space="0" w:color="D3D3D3"/>
-              <w:bottom w:val="single" w:space="0" w:color="D3D3D3"/>
-              <w:start w:val="single" w:space="0" w:color="D3D3D3"/>
-              <w:end w:val="single" w:space="0" w:color="D3D3D3"/>
-            </w:tcBorders>
-          </w:tcPr>
-          <w:p>
-            <w:pPr>
-              <w:spacing w:before="0" w:after="60"/>
-              <w:keepNext/>
-              <w:jc w:val="center"/>
-            </w:pPr>
-            <w:r>
-              <w:rPr>
-                <w:rFonts w:ascii="Calibri" w:hAnsi="Calibri"/>
-                <w:sz w:val="20"/>
-              </w:rPr>
-              <w:t xml:space="default">157 (44%)</w:t>
-            </w:r>
-          </w:p>
-        </w:tc>
-        <w:tc>
-          <w:tcPr>
-            <w:tcBorders>
-              <w:top w:val="single" w:space="0" w:color="D3D3D3"/>
-              <w:bottom w:val="single" w:space="0" w:color="D3D3D3"/>
-              <w:start w:val="single" w:space="0" w:color="D3D3D3"/>
-              <w:end w:val="single" w:space="0" w:color="D3D3D3"/>
-            </w:tcBorders>
-          </w:tcPr>
-          <w:p>
-            <w:pPr>
-              <w:spacing w:before="0" w:after="60"/>
-              <w:keepNext/>
-              <w:jc w:val="center"/>
-            </w:pPr>
-            <w:r>
-              <w:rPr>
-                <w:rFonts w:ascii="Calibri" w:hAnsi="Calibri"/>
-                <w:sz w:val="20"/>
-              </w:rPr>
-              <w:t xml:space="default">182 (36%)</w:t>
-            </w:r>
-          </w:p>
-        </w:tc>
-        <w:tc>
-          <w:tcPr>
-            <w:tcBorders>
-              <w:top w:val="single" w:space="0" w:color="D3D3D3"/>
-              <w:bottom w:val="single" w:space="0" w:color="D3D3D3"/>
-              <w:start w:val="single" w:space="0" w:color="D3D3D3"/>
-              <w:end w:val="single" w:space="0" w:color="D3D3D3"/>
-            </w:tcBorders>
-          </w:tcPr>
-          <w:p>
-            <w:pPr>
-              <w:spacing w:before="0" w:after="60"/>
-              <w:keepNext/>
-              <w:jc w:val="center"/>
-            </w:pPr>
-            <w:r>
-              <w:rPr>
-                <w:rFonts w:ascii="Calibri" w:hAnsi="Calibri"/>
-                <w:sz w:val="20"/>
-              </w:rPr>
-              <w:t xml:space="default">172 (40%)</w:t>
-            </w:r>
-          </w:p>
-        </w:tc>
-        <w:tc>
-          <w:tcPr>
-            <w:tcBorders>
-              <w:top w:val="single" w:space="0" w:color="D3D3D3"/>
-              <w:bottom w:val="single" w:space="0" w:color="D3D3D3"/>
-              <w:start w:val="single" w:space="0" w:color="D3D3D3"/>
-              <w:end w:val="single" w:space="0" w:color="D3D3D3"/>
-            </w:tcBorders>
-          </w:tcPr>
-          <w:p>
-            <w:pPr>
-              <w:spacing w:before="0" w:after="60"/>
-              <w:keepNext/>
-              <w:jc w:val="center"/>
-            </w:pPr>
-            <w:r>
-              <w:rPr>
-                <w:rFonts w:ascii="Calibri" w:hAnsi="Calibri"/>
-                <w:sz w:val="20"/>
-              </w:rPr>
-              <w:t xml:space="default">218 (38%)</w:t>
-            </w:r>
-          </w:p>
-        </w:tc>
-        <w:tc>
-          <w:tcPr>
-            <w:tcBorders>
-              <w:top w:val="single" w:space="0" w:color="D3D3D3"/>
-              <w:bottom w:val="single" w:space="0" w:color="D3D3D3"/>
-              <w:start w:val="single" w:space="0" w:color="D3D3D3"/>
-              <w:end w:val="single" w:space="0" w:color="D3D3D3"/>
-            </w:tcBorders>
-          </w:tcPr>
-          <w:p>
-            <w:pPr>
-              <w:spacing w:before="0" w:after="60"/>
-              <w:keepNext/>
-              <w:jc w:val="center"/>
-            </w:pPr>
-            <w:r>
-              <w:rPr>
-                <w:rFonts w:ascii="Calibri" w:hAnsi="Calibri"/>
-                <w:sz w:val="20"/>
-              </w:rPr>
-              <w:t xml:space="default">128 (37%)</w:t>
+              <w:t xml:space="default">    Near Poverty (100-130% PIR)</w:t>
+            </w:r>
+          </w:p>
+        </w:tc>
+        <w:tc>
+          <w:tcPr>
+            <w:tcBorders>
+              <w:top w:val="single" w:space="0" w:color="D3D3D3"/>
+              <w:bottom w:val="single" w:space="0" w:color="D3D3D3"/>
+              <w:start w:val="single" w:space="0" w:color="D3D3D3"/>
+              <w:end w:val="single" w:space="0" w:color="D3D3D3"/>
+            </w:tcBorders>
+          </w:tcPr>
+          <w:p>
+            <w:pPr>
+              <w:spacing w:before="0" w:after="60"/>
+              <w:keepNext/>
+              <w:jc w:val="center"/>
+            </w:pPr>
+            <w:r>
+              <w:rPr>
+                <w:rFonts w:ascii="Calibri" w:hAnsi="Calibri"/>
+                <w:sz w:val="20"/>
+              </w:rPr>
+              <w:t xml:space="default">46 (6.9%)</w:t>
+            </w:r>
+          </w:p>
+        </w:tc>
+        <w:tc>
+          <w:tcPr>
+            <w:tcBorders>
+              <w:top w:val="single" w:space="0" w:color="D3D3D3"/>
+              <w:bottom w:val="single" w:space="0" w:color="D3D3D3"/>
+              <w:start w:val="single" w:space="0" w:color="D3D3D3"/>
+              <w:end w:val="single" w:space="0" w:color="D3D3D3"/>
+            </w:tcBorders>
+          </w:tcPr>
+          <w:p>
+            <w:pPr>
+              <w:spacing w:before="0" w:after="60"/>
+              <w:keepNext/>
+              <w:jc w:val="center"/>
+            </w:pPr>
+            <w:r>
+              <w:rPr>
+                <w:rFonts w:ascii="Calibri" w:hAnsi="Calibri"/>
+                <w:sz w:val="20"/>
+              </w:rPr>
+              <w:t xml:space="default">56 (8.5%)</w:t>
+            </w:r>
+          </w:p>
+        </w:tc>
+        <w:tc>
+          <w:tcPr>
+            <w:tcBorders>
+              <w:top w:val="single" w:space="0" w:color="D3D3D3"/>
+              <w:bottom w:val="single" w:space="0" w:color="D3D3D3"/>
+              <w:start w:val="single" w:space="0" w:color="D3D3D3"/>
+              <w:end w:val="single" w:space="0" w:color="D3D3D3"/>
+            </w:tcBorders>
+          </w:tcPr>
+          <w:p>
+            <w:pPr>
+              <w:spacing w:before="0" w:after="60"/>
+              <w:keepNext/>
+              <w:jc w:val="center"/>
+            </w:pPr>
+            <w:r>
+              <w:rPr>
+                <w:rFonts w:ascii="Calibri" w:hAnsi="Calibri"/>
+                <w:sz w:val="20"/>
+              </w:rPr>
+              <w:t xml:space="default">82 (11%)</w:t>
+            </w:r>
+          </w:p>
+        </w:tc>
+        <w:tc>
+          <w:tcPr>
+            <w:tcBorders>
+              <w:top w:val="single" w:space="0" w:color="D3D3D3"/>
+              <w:bottom w:val="single" w:space="0" w:color="D3D3D3"/>
+              <w:start w:val="single" w:space="0" w:color="D3D3D3"/>
+              <w:end w:val="single" w:space="0" w:color="D3D3D3"/>
+            </w:tcBorders>
+          </w:tcPr>
+          <w:p>
+            <w:pPr>
+              <w:spacing w:before="0" w:after="60"/>
+              <w:keepNext/>
+              <w:jc w:val="center"/>
+            </w:pPr>
+            <w:r>
+              <w:rPr>
+                <w:rFonts w:ascii="Calibri" w:hAnsi="Calibri"/>
+                <w:sz w:val="20"/>
+              </w:rPr>
+              <w:t xml:space="default">57 (13%)</w:t>
+            </w:r>
+          </w:p>
+        </w:tc>
+        <w:tc>
+          <w:tcPr>
+            <w:tcBorders>
+              <w:top w:val="single" w:space="0" w:color="D3D3D3"/>
+              <w:bottom w:val="single" w:space="0" w:color="D3D3D3"/>
+              <w:start w:val="single" w:space="0" w:color="D3D3D3"/>
+              <w:end w:val="single" w:space="0" w:color="D3D3D3"/>
+            </w:tcBorders>
+          </w:tcPr>
+          <w:p>
+            <w:pPr>
+              <w:spacing w:before="0" w:after="60"/>
+              <w:keepNext/>
+              <w:jc w:val="center"/>
+            </w:pPr>
+            <w:r>
+              <w:rPr>
+                <w:rFonts w:ascii="Calibri" w:hAnsi="Calibri"/>
+                <w:sz w:val="20"/>
+              </w:rPr>
+              <w:t xml:space="default">46 (5.7%)</w:t>
+            </w:r>
+          </w:p>
+        </w:tc>
+        <w:tc>
+          <w:tcPr>
+            <w:tcBorders>
+              <w:top w:val="single" w:space="0" w:color="D3D3D3"/>
+              <w:bottom w:val="single" w:space="0" w:color="D3D3D3"/>
+              <w:start w:val="single" w:space="0" w:color="D3D3D3"/>
+              <w:end w:val="single" w:space="0" w:color="D3D3D3"/>
+            </w:tcBorders>
+          </w:tcPr>
+          <w:p>
+            <w:pPr>
+              <w:spacing w:before="0" w:after="60"/>
+              <w:keepNext/>
+              <w:jc w:val="center"/>
+            </w:pPr>
+            <w:r>
+              <w:rPr>
+                <w:rFonts w:ascii="Calibri" w:hAnsi="Calibri"/>
+                <w:sz w:val="20"/>
+              </w:rPr>
+              <w:t xml:space="default">61 (8.8%)</w:t>
+            </w:r>
+          </w:p>
+        </w:tc>
+        <w:tc>
+          <w:tcPr>
+            <w:tcBorders>
+              <w:top w:val="single" w:space="0" w:color="D3D3D3"/>
+              <w:bottom w:val="single" w:space="0" w:color="D3D3D3"/>
+              <w:start w:val="single" w:space="0" w:color="D3D3D3"/>
+              <w:end w:val="single" w:space="0" w:color="D3D3D3"/>
+            </w:tcBorders>
+          </w:tcPr>
+          <w:p>
+            <w:pPr>
+              <w:spacing w:before="0" w:after="60"/>
+              <w:keepNext/>
+              <w:jc w:val="center"/>
+            </w:pPr>
+            <w:r>
+              <w:rPr>
+                <w:rFonts w:ascii="Calibri" w:hAnsi="Calibri"/>
+                <w:sz w:val="20"/>
+              </w:rPr>
+              <w:t xml:space="default">78 (10%)</w:t>
+            </w:r>
+          </w:p>
+        </w:tc>
+        <w:tc>
+          <w:tcPr>
+            <w:tcBorders>
+              <w:top w:val="single" w:space="0" w:color="D3D3D3"/>
+              <w:bottom w:val="single" w:space="0" w:color="D3D3D3"/>
+              <w:start w:val="single" w:space="0" w:color="D3D3D3"/>
+              <w:end w:val="single" w:space="0" w:color="D3D3D3"/>
+            </w:tcBorders>
+          </w:tcPr>
+          <w:p>
+            <w:pPr>
+              <w:spacing w:before="0" w:after="60"/>
+              <w:keepNext/>
+              <w:jc w:val="center"/>
+            </w:pPr>
+            <w:r>
+              <w:rPr>
+                <w:rFonts w:ascii="Calibri" w:hAnsi="Calibri"/>
+                <w:sz w:val="20"/>
+              </w:rPr>
+              <w:t xml:space="default">61 (12%)</w:t>
             </w:r>
           </w:p>
         </w:tc>
@@ -2975,199 +2975,199 @@
                 <w:rFonts w:ascii="Calibri" w:hAnsi="Calibri"/>
                 <w:sz w:val="20"/>
               </w:rPr>
-              <w:t xml:space="default">    High Income (&gt; 350% PIR)</w:t>
-            </w:r>
-          </w:p>
-        </w:tc>
-        <w:tc>
-          <w:tcPr>
-            <w:tcBorders>
-              <w:top w:val="single" w:space="0" w:color="D3D3D3"/>
-              <w:bottom w:val="single" w:space="0" w:color="D3D3D3"/>
-              <w:start w:val="single" w:space="0" w:color="D3D3D3"/>
-              <w:end w:val="single" w:space="0" w:color="D3D3D3"/>
-            </w:tcBorders>
-          </w:tcPr>
-          <w:p>
-            <w:pPr>
-              <w:spacing w:before="0" w:after="60"/>
-              <w:keepNext/>
-              <w:jc w:val="center"/>
-            </w:pPr>
-            <w:r>
-              <w:rPr>
-                <w:rFonts w:ascii="Calibri" w:hAnsi="Calibri"/>
-                <w:sz w:val="20"/>
-              </w:rPr>
-              <w:t xml:space="default">122 (34%)</w:t>
-            </w:r>
-          </w:p>
-        </w:tc>
-        <w:tc>
-          <w:tcPr>
-            <w:tcBorders>
-              <w:top w:val="single" w:space="0" w:color="D3D3D3"/>
-              <w:bottom w:val="single" w:space="0" w:color="D3D3D3"/>
-              <w:start w:val="single" w:space="0" w:color="D3D3D3"/>
-              <w:end w:val="single" w:space="0" w:color="D3D3D3"/>
-            </w:tcBorders>
-          </w:tcPr>
-          <w:p>
-            <w:pPr>
-              <w:spacing w:before="0" w:after="60"/>
-              <w:keepNext/>
-              <w:jc w:val="center"/>
-            </w:pPr>
-            <w:r>
-              <w:rPr>
-                <w:rFonts w:ascii="Calibri" w:hAnsi="Calibri"/>
-                <w:sz w:val="20"/>
-              </w:rPr>
-              <w:t xml:space="default">124 (34%)</w:t>
-            </w:r>
-          </w:p>
-        </w:tc>
-        <w:tc>
-          <w:tcPr>
-            <w:tcBorders>
-              <w:top w:val="single" w:space="0" w:color="D3D3D3"/>
-              <w:bottom w:val="single" w:space="0" w:color="D3D3D3"/>
-              <w:start w:val="single" w:space="0" w:color="D3D3D3"/>
-              <w:end w:val="single" w:space="0" w:color="D3D3D3"/>
-            </w:tcBorders>
-          </w:tcPr>
-          <w:p>
-            <w:pPr>
-              <w:spacing w:before="0" w:after="60"/>
-              <w:keepNext/>
-              <w:jc w:val="center"/>
-            </w:pPr>
-            <w:r>
-              <w:rPr>
-                <w:rFonts w:ascii="Calibri" w:hAnsi="Calibri"/>
-                <w:sz w:val="20"/>
-              </w:rPr>
-              <w:t xml:space="default">122 (27%)</w:t>
-            </w:r>
-          </w:p>
-        </w:tc>
-        <w:tc>
-          <w:tcPr>
-            <w:tcBorders>
-              <w:top w:val="single" w:space="0" w:color="D3D3D3"/>
-              <w:bottom w:val="single" w:space="0" w:color="D3D3D3"/>
-              <w:start w:val="single" w:space="0" w:color="D3D3D3"/>
-              <w:end w:val="single" w:space="0" w:color="D3D3D3"/>
-            </w:tcBorders>
-          </w:tcPr>
-          <w:p>
-            <w:pPr>
-              <w:spacing w:before="0" w:after="60"/>
-              <w:keepNext/>
-              <w:jc w:val="center"/>
-            </w:pPr>
-            <w:r>
-              <w:rPr>
-                <w:rFonts w:ascii="Calibri" w:hAnsi="Calibri"/>
-                <w:sz w:val="20"/>
-              </w:rPr>
-              <w:t xml:space="default">50 (19%)</w:t>
-            </w:r>
-          </w:p>
-        </w:tc>
-        <w:tc>
-          <w:tcPr>
-            <w:tcBorders>
-              <w:top w:val="single" w:space="0" w:color="D3D3D3"/>
-              <w:bottom w:val="single" w:space="0" w:color="D3D3D3"/>
-              <w:start w:val="single" w:space="0" w:color="D3D3D3"/>
-              <w:end w:val="single" w:space="0" w:color="D3D3D3"/>
-            </w:tcBorders>
-          </w:tcPr>
-          <w:p>
-            <w:pPr>
-              <w:spacing w:before="0" w:after="60"/>
-              <w:keepNext/>
-              <w:jc w:val="center"/>
-            </w:pPr>
-            <w:r>
-              <w:rPr>
-                <w:rFonts w:ascii="Calibri" w:hAnsi="Calibri"/>
-                <w:sz w:val="20"/>
-              </w:rPr>
-              <w:t xml:space="default">141 (40%)</w:t>
-            </w:r>
-          </w:p>
-        </w:tc>
-        <w:tc>
-          <w:tcPr>
-            <w:tcBorders>
-              <w:top w:val="single" w:space="0" w:color="D3D3D3"/>
-              <w:bottom w:val="single" w:space="0" w:color="D3D3D3"/>
-              <w:start w:val="single" w:space="0" w:color="D3D3D3"/>
-              <w:end w:val="single" w:space="0" w:color="D3D3D3"/>
-            </w:tcBorders>
-          </w:tcPr>
-          <w:p>
-            <w:pPr>
-              <w:spacing w:before="0" w:after="60"/>
-              <w:keepNext/>
-              <w:jc w:val="center"/>
-            </w:pPr>
-            <w:r>
-              <w:rPr>
-                <w:rFonts w:ascii="Calibri" w:hAnsi="Calibri"/>
-                <w:sz w:val="20"/>
-              </w:rPr>
-              <w:t xml:space="default">94 (31%)</w:t>
-            </w:r>
-          </w:p>
-        </w:tc>
-        <w:tc>
-          <w:tcPr>
-            <w:tcBorders>
-              <w:top w:val="single" w:space="0" w:color="D3D3D3"/>
-              <w:bottom w:val="single" w:space="0" w:color="D3D3D3"/>
-              <w:start w:val="single" w:space="0" w:color="D3D3D3"/>
-              <w:end w:val="single" w:space="0" w:color="D3D3D3"/>
-            </w:tcBorders>
-          </w:tcPr>
-          <w:p>
-            <w:pPr>
-              <w:spacing w:before="0" w:after="60"/>
-              <w:keepNext/>
-              <w:jc w:val="center"/>
-            </w:pPr>
-            <w:r>
-              <w:rPr>
-                <w:rFonts w:ascii="Calibri" w:hAnsi="Calibri"/>
-                <w:sz w:val="20"/>
-              </w:rPr>
-              <w:t xml:space="default">114 (31%)</w:t>
-            </w:r>
-          </w:p>
-        </w:tc>
-        <w:tc>
-          <w:tcPr>
-            <w:tcBorders>
-              <w:top w:val="single" w:space="0" w:color="D3D3D3"/>
-              <w:bottom w:val="single" w:space="0" w:color="D3D3D3"/>
-              <w:start w:val="single" w:space="0" w:color="D3D3D3"/>
-              <w:end w:val="single" w:space="0" w:color="D3D3D3"/>
-            </w:tcBorders>
-          </w:tcPr>
-          <w:p>
-            <w:pPr>
-              <w:spacing w:before="0" w:after="60"/>
-              <w:keepNext/>
-              <w:jc w:val="center"/>
-            </w:pPr>
-            <w:r>
-              <w:rPr>
-                <w:rFonts w:ascii="Calibri" w:hAnsi="Calibri"/>
-                <w:sz w:val="20"/>
-              </w:rPr>
-              <w:t xml:space="default">61 (22%)</w:t>
+              <w:t xml:space="default">    Low-Middle Income (131-199% PIR)</w:t>
+            </w:r>
+          </w:p>
+        </w:tc>
+        <w:tc>
+          <w:tcPr>
+            <w:tcBorders>
+              <w:top w:val="single" w:space="0" w:color="D3D3D3"/>
+              <w:bottom w:val="single" w:space="0" w:color="D3D3D3"/>
+              <w:start w:val="single" w:space="0" w:color="D3D3D3"/>
+              <w:end w:val="single" w:space="0" w:color="D3D3D3"/>
+            </w:tcBorders>
+          </w:tcPr>
+          <w:p>
+            <w:pPr>
+              <w:spacing w:before="0" w:after="60"/>
+              <w:keepNext/>
+              <w:jc w:val="center"/>
+            </w:pPr>
+            <w:r>
+              <w:rPr>
+                <w:rFonts w:ascii="Calibri" w:hAnsi="Calibri"/>
+                <w:sz w:val="20"/>
+              </w:rPr>
+              <w:t xml:space="default">81 (14%)</w:t>
+            </w:r>
+          </w:p>
+        </w:tc>
+        <w:tc>
+          <w:tcPr>
+            <w:tcBorders>
+              <w:top w:val="single" w:space="0" w:color="D3D3D3"/>
+              <w:bottom w:val="single" w:space="0" w:color="D3D3D3"/>
+              <w:start w:val="single" w:space="0" w:color="D3D3D3"/>
+              <w:end w:val="single" w:space="0" w:color="D3D3D3"/>
+            </w:tcBorders>
+          </w:tcPr>
+          <w:p>
+            <w:pPr>
+              <w:spacing w:before="0" w:after="60"/>
+              <w:keepNext/>
+              <w:jc w:val="center"/>
+            </w:pPr>
+            <w:r>
+              <w:rPr>
+                <w:rFonts w:ascii="Calibri" w:hAnsi="Calibri"/>
+                <w:sz w:val="20"/>
+              </w:rPr>
+              <w:t xml:space="default">103 (16%)</w:t>
+            </w:r>
+          </w:p>
+        </w:tc>
+        <w:tc>
+          <w:tcPr>
+            <w:tcBorders>
+              <w:top w:val="single" w:space="0" w:color="D3D3D3"/>
+              <w:bottom w:val="single" w:space="0" w:color="D3D3D3"/>
+              <w:start w:val="single" w:space="0" w:color="D3D3D3"/>
+              <w:end w:val="single" w:space="0" w:color="D3D3D3"/>
+            </w:tcBorders>
+          </w:tcPr>
+          <w:p>
+            <w:pPr>
+              <w:spacing w:before="0" w:after="60"/>
+              <w:keepNext/>
+              <w:jc w:val="center"/>
+            </w:pPr>
+            <w:r>
+              <w:rPr>
+                <w:rFonts w:ascii="Calibri" w:hAnsi="Calibri"/>
+                <w:sz w:val="20"/>
+              </w:rPr>
+              <w:t xml:space="default">107 (15%)</w:t>
+            </w:r>
+          </w:p>
+        </w:tc>
+        <w:tc>
+          <w:tcPr>
+            <w:tcBorders>
+              <w:top w:val="single" w:space="0" w:color="D3D3D3"/>
+              <w:bottom w:val="single" w:space="0" w:color="D3D3D3"/>
+              <w:start w:val="single" w:space="0" w:color="D3D3D3"/>
+              <w:end w:val="single" w:space="0" w:color="D3D3D3"/>
+            </w:tcBorders>
+          </w:tcPr>
+          <w:p>
+            <w:pPr>
+              <w:spacing w:before="0" w:after="60"/>
+              <w:keepNext/>
+              <w:jc w:val="center"/>
+            </w:pPr>
+            <w:r>
+              <w:rPr>
+                <w:rFonts w:ascii="Calibri" w:hAnsi="Calibri"/>
+                <w:sz w:val="20"/>
+              </w:rPr>
+              <w:t xml:space="default">71 (17%)</w:t>
+            </w:r>
+          </w:p>
+        </w:tc>
+        <w:tc>
+          <w:tcPr>
+            <w:tcBorders>
+              <w:top w:val="single" w:space="0" w:color="D3D3D3"/>
+              <w:bottom w:val="single" w:space="0" w:color="D3D3D3"/>
+              <w:start w:val="single" w:space="0" w:color="D3D3D3"/>
+              <w:end w:val="single" w:space="0" w:color="D3D3D3"/>
+            </w:tcBorders>
+          </w:tcPr>
+          <w:p>
+            <w:pPr>
+              <w:spacing w:before="0" w:after="60"/>
+              <w:keepNext/>
+              <w:jc w:val="center"/>
+            </w:pPr>
+            <w:r>
+              <w:rPr>
+                <w:rFonts w:ascii="Calibri" w:hAnsi="Calibri"/>
+                <w:sz w:val="20"/>
+              </w:rPr>
+              <w:t xml:space="default">83 (13%)</w:t>
+            </w:r>
+          </w:p>
+        </w:tc>
+        <w:tc>
+          <w:tcPr>
+            <w:tcBorders>
+              <w:top w:val="single" w:space="0" w:color="D3D3D3"/>
+              <w:bottom w:val="single" w:space="0" w:color="D3D3D3"/>
+              <w:start w:val="single" w:space="0" w:color="D3D3D3"/>
+              <w:end w:val="single" w:space="0" w:color="D3D3D3"/>
+            </w:tcBorders>
+          </w:tcPr>
+          <w:p>
+            <w:pPr>
+              <w:spacing w:before="0" w:after="60"/>
+              <w:keepNext/>
+              <w:jc w:val="center"/>
+            </w:pPr>
+            <w:r>
+              <w:rPr>
+                <w:rFonts w:ascii="Calibri" w:hAnsi="Calibri"/>
+                <w:sz w:val="20"/>
+              </w:rPr>
+              <w:t xml:space="default">88 (17%)</w:t>
+            </w:r>
+          </w:p>
+        </w:tc>
+        <w:tc>
+          <w:tcPr>
+            <w:tcBorders>
+              <w:top w:val="single" w:space="0" w:color="D3D3D3"/>
+              <w:bottom w:val="single" w:space="0" w:color="D3D3D3"/>
+              <w:start w:val="single" w:space="0" w:color="D3D3D3"/>
+              <w:end w:val="single" w:space="0" w:color="D3D3D3"/>
+            </w:tcBorders>
+          </w:tcPr>
+          <w:p>
+            <w:pPr>
+              <w:spacing w:before="0" w:after="60"/>
+              <w:keepNext/>
+              <w:jc w:val="center"/>
+            </w:pPr>
+            <w:r>
+              <w:rPr>
+                <w:rFonts w:ascii="Calibri" w:hAnsi="Calibri"/>
+                <w:sz w:val="20"/>
+              </w:rPr>
+              <w:t xml:space="default">98 (15%)</w:t>
+            </w:r>
+          </w:p>
+        </w:tc>
+        <w:tc>
+          <w:tcPr>
+            <w:tcBorders>
+              <w:top w:val="single" w:space="0" w:color="D3D3D3"/>
+              <w:bottom w:val="single" w:space="0" w:color="D3D3D3"/>
+              <w:start w:val="single" w:space="0" w:color="D3D3D3"/>
+              <w:end w:val="single" w:space="0" w:color="D3D3D3"/>
+            </w:tcBorders>
+          </w:tcPr>
+          <w:p>
+            <w:pPr>
+              <w:spacing w:before="0" w:after="60"/>
+              <w:keepNext/>
+              <w:jc w:val="center"/>
+            </w:pPr>
+            <w:r>
+              <w:rPr>
+                <w:rFonts w:ascii="Calibri" w:hAnsi="Calibri"/>
+                <w:sz w:val="20"/>
+              </w:rPr>
+              <w:t xml:space="default">62 (14%)</w:t>
             </w:r>
           </w:p>
         </w:tc>
@@ -3196,199 +3196,199 @@
                 <w:rFonts w:ascii="Calibri" w:hAnsi="Calibri"/>
                 <w:sz w:val="20"/>
               </w:rPr>
-              <w:t xml:space="default">Parent Education</w:t>
-            </w:r>
-          </w:p>
-        </w:tc>
-        <w:tc>
-          <w:tcPr>
-            <w:tcBorders>
-              <w:top w:val="single" w:space="0" w:color="D3D3D3"/>
-              <w:bottom w:val="single" w:space="0" w:color="D3D3D3"/>
-              <w:start w:val="single" w:space="0" w:color="D3D3D3"/>
-              <w:end w:val="single" w:space="0" w:color="D3D3D3"/>
-            </w:tcBorders>
-          </w:tcPr>
-          <w:p>
-            <w:pPr>
-              <w:spacing w:before="0" w:after="60"/>
-              <w:keepNext/>
-              <w:jc w:val="center"/>
-            </w:pPr>
-            <w:r>
-              <w:rPr>
-                <w:rFonts w:ascii="Calibri" w:hAnsi="Calibri"/>
-                <w:sz w:val="20"/>
-              </w:rPr>
-              <w:t xml:space="default"/>
-            </w:r>
-          </w:p>
-        </w:tc>
-        <w:tc>
-          <w:tcPr>
-            <w:tcBorders>
-              <w:top w:val="single" w:space="0" w:color="D3D3D3"/>
-              <w:bottom w:val="single" w:space="0" w:color="D3D3D3"/>
-              <w:start w:val="single" w:space="0" w:color="D3D3D3"/>
-              <w:end w:val="single" w:space="0" w:color="D3D3D3"/>
-            </w:tcBorders>
-          </w:tcPr>
-          <w:p>
-            <w:pPr>
-              <w:spacing w:before="0" w:after="60"/>
-              <w:keepNext/>
-              <w:jc w:val="center"/>
-            </w:pPr>
-            <w:r>
-              <w:rPr>
-                <w:rFonts w:ascii="Calibri" w:hAnsi="Calibri"/>
-                <w:sz w:val="20"/>
-              </w:rPr>
-              <w:t xml:space="default"/>
-            </w:r>
-          </w:p>
-        </w:tc>
-        <w:tc>
-          <w:tcPr>
-            <w:tcBorders>
-              <w:top w:val="single" w:space="0" w:color="D3D3D3"/>
-              <w:bottom w:val="single" w:space="0" w:color="D3D3D3"/>
-              <w:start w:val="single" w:space="0" w:color="D3D3D3"/>
-              <w:end w:val="single" w:space="0" w:color="D3D3D3"/>
-            </w:tcBorders>
-          </w:tcPr>
-          <w:p>
-            <w:pPr>
-              <w:spacing w:before="0" w:after="60"/>
-              <w:keepNext/>
-              <w:jc w:val="center"/>
-            </w:pPr>
-            <w:r>
-              <w:rPr>
-                <w:rFonts w:ascii="Calibri" w:hAnsi="Calibri"/>
-                <w:sz w:val="20"/>
-              </w:rPr>
-              <w:t xml:space="default"/>
-            </w:r>
-          </w:p>
-        </w:tc>
-        <w:tc>
-          <w:tcPr>
-            <w:tcBorders>
-              <w:top w:val="single" w:space="0" w:color="D3D3D3"/>
-              <w:bottom w:val="single" w:space="0" w:color="D3D3D3"/>
-              <w:start w:val="single" w:space="0" w:color="D3D3D3"/>
-              <w:end w:val="single" w:space="0" w:color="D3D3D3"/>
-            </w:tcBorders>
-          </w:tcPr>
-          <w:p>
-            <w:pPr>
-              <w:spacing w:before="0" w:after="60"/>
-              <w:keepNext/>
-              <w:jc w:val="center"/>
-            </w:pPr>
-            <w:r>
-              <w:rPr>
-                <w:rFonts w:ascii="Calibri" w:hAnsi="Calibri"/>
-                <w:sz w:val="20"/>
-              </w:rPr>
-              <w:t xml:space="default"/>
-            </w:r>
-          </w:p>
-        </w:tc>
-        <w:tc>
-          <w:tcPr>
-            <w:tcBorders>
-              <w:top w:val="single" w:space="0" w:color="D3D3D3"/>
-              <w:bottom w:val="single" w:space="0" w:color="D3D3D3"/>
-              <w:start w:val="single" w:space="0" w:color="D3D3D3"/>
-              <w:end w:val="single" w:space="0" w:color="D3D3D3"/>
-            </w:tcBorders>
-          </w:tcPr>
-          <w:p>
-            <w:pPr>
-              <w:spacing w:before="0" w:after="60"/>
-              <w:keepNext/>
-              <w:jc w:val="center"/>
-            </w:pPr>
-            <w:r>
-              <w:rPr>
-                <w:rFonts w:ascii="Calibri" w:hAnsi="Calibri"/>
-                <w:sz w:val="20"/>
-              </w:rPr>
-              <w:t xml:space="default"/>
-            </w:r>
-          </w:p>
-        </w:tc>
-        <w:tc>
-          <w:tcPr>
-            <w:tcBorders>
-              <w:top w:val="single" w:space="0" w:color="D3D3D3"/>
-              <w:bottom w:val="single" w:space="0" w:color="D3D3D3"/>
-              <w:start w:val="single" w:space="0" w:color="D3D3D3"/>
-              <w:end w:val="single" w:space="0" w:color="D3D3D3"/>
-            </w:tcBorders>
-          </w:tcPr>
-          <w:p>
-            <w:pPr>
-              <w:spacing w:before="0" w:after="60"/>
-              <w:keepNext/>
-              <w:jc w:val="center"/>
-            </w:pPr>
-            <w:r>
-              <w:rPr>
-                <w:rFonts w:ascii="Calibri" w:hAnsi="Calibri"/>
-                <w:sz w:val="20"/>
-              </w:rPr>
-              <w:t xml:space="default"/>
-            </w:r>
-          </w:p>
-        </w:tc>
-        <w:tc>
-          <w:tcPr>
-            <w:tcBorders>
-              <w:top w:val="single" w:space="0" w:color="D3D3D3"/>
-              <w:bottom w:val="single" w:space="0" w:color="D3D3D3"/>
-              <w:start w:val="single" w:space="0" w:color="D3D3D3"/>
-              <w:end w:val="single" w:space="0" w:color="D3D3D3"/>
-            </w:tcBorders>
-          </w:tcPr>
-          <w:p>
-            <w:pPr>
-              <w:spacing w:before="0" w:after="60"/>
-              <w:keepNext/>
-              <w:jc w:val="center"/>
-            </w:pPr>
-            <w:r>
-              <w:rPr>
-                <w:rFonts w:ascii="Calibri" w:hAnsi="Calibri"/>
-                <w:sz w:val="20"/>
-              </w:rPr>
-              <w:t xml:space="default"/>
-            </w:r>
-          </w:p>
-        </w:tc>
-        <w:tc>
-          <w:tcPr>
-            <w:tcBorders>
-              <w:top w:val="single" w:space="0" w:color="D3D3D3"/>
-              <w:bottom w:val="single" w:space="0" w:color="D3D3D3"/>
-              <w:start w:val="single" w:space="0" w:color="D3D3D3"/>
-              <w:end w:val="single" w:space="0" w:color="D3D3D3"/>
-            </w:tcBorders>
-          </w:tcPr>
-          <w:p>
-            <w:pPr>
-              <w:spacing w:before="0" w:after="60"/>
-              <w:keepNext/>
-              <w:jc w:val="center"/>
-            </w:pPr>
-            <w:r>
-              <w:rPr>
-                <w:rFonts w:ascii="Calibri" w:hAnsi="Calibri"/>
-                <w:sz w:val="20"/>
-              </w:rPr>
-              <w:t xml:space="default"/>
+              <w:t xml:space="default">    High-Middle Income (200-350% PIR)</w:t>
+            </w:r>
+          </w:p>
+        </w:tc>
+        <w:tc>
+          <w:tcPr>
+            <w:tcBorders>
+              <w:top w:val="single" w:space="0" w:color="D3D3D3"/>
+              <w:bottom w:val="single" w:space="0" w:color="D3D3D3"/>
+              <w:start w:val="single" w:space="0" w:color="D3D3D3"/>
+              <w:end w:val="single" w:space="0" w:color="D3D3D3"/>
+            </w:tcBorders>
+          </w:tcPr>
+          <w:p>
+            <w:pPr>
+              <w:spacing w:before="0" w:after="60"/>
+              <w:keepNext/>
+              <w:jc w:val="center"/>
+            </w:pPr>
+            <w:r>
+              <w:rPr>
+                <w:rFonts w:ascii="Calibri" w:hAnsi="Calibri"/>
+                <w:sz w:val="20"/>
+              </w:rPr>
+              <w:t xml:space="default">104 (29%)</w:t>
+            </w:r>
+          </w:p>
+        </w:tc>
+        <w:tc>
+          <w:tcPr>
+            <w:tcBorders>
+              <w:top w:val="single" w:space="0" w:color="D3D3D3"/>
+              <w:bottom w:val="single" w:space="0" w:color="D3D3D3"/>
+              <w:start w:val="single" w:space="0" w:color="D3D3D3"/>
+              <w:end w:val="single" w:space="0" w:color="D3D3D3"/>
+            </w:tcBorders>
+          </w:tcPr>
+          <w:p>
+            <w:pPr>
+              <w:spacing w:before="0" w:after="60"/>
+              <w:keepNext/>
+              <w:jc w:val="center"/>
+            </w:pPr>
+            <w:r>
+              <w:rPr>
+                <w:rFonts w:ascii="Calibri" w:hAnsi="Calibri"/>
+                <w:sz w:val="20"/>
+              </w:rPr>
+              <w:t xml:space="default">101 (20%)</w:t>
+            </w:r>
+          </w:p>
+        </w:tc>
+        <w:tc>
+          <w:tcPr>
+            <w:tcBorders>
+              <w:top w:val="single" w:space="0" w:color="D3D3D3"/>
+              <w:bottom w:val="single" w:space="0" w:color="D3D3D3"/>
+              <w:start w:val="single" w:space="0" w:color="D3D3D3"/>
+              <w:end w:val="single" w:space="0" w:color="D3D3D3"/>
+            </w:tcBorders>
+          </w:tcPr>
+          <w:p>
+            <w:pPr>
+              <w:spacing w:before="0" w:after="60"/>
+              <w:keepNext/>
+              <w:jc w:val="center"/>
+            </w:pPr>
+            <w:r>
+              <w:rPr>
+                <w:rFonts w:ascii="Calibri" w:hAnsi="Calibri"/>
+                <w:sz w:val="20"/>
+              </w:rPr>
+              <w:t xml:space="default">130 (26%)</w:t>
+            </w:r>
+          </w:p>
+        </w:tc>
+        <w:tc>
+          <w:tcPr>
+            <w:tcBorders>
+              <w:top w:val="single" w:space="0" w:color="D3D3D3"/>
+              <w:bottom w:val="single" w:space="0" w:color="D3D3D3"/>
+              <w:start w:val="single" w:space="0" w:color="D3D3D3"/>
+              <w:end w:val="single" w:space="0" w:color="D3D3D3"/>
+            </w:tcBorders>
+          </w:tcPr>
+          <w:p>
+            <w:pPr>
+              <w:spacing w:before="0" w:after="60"/>
+              <w:keepNext/>
+              <w:jc w:val="center"/>
+            </w:pPr>
+            <w:r>
+              <w:rPr>
+                <w:rFonts w:ascii="Calibri" w:hAnsi="Calibri"/>
+                <w:sz w:val="20"/>
+              </w:rPr>
+              <w:t xml:space="default">86 (27%)</w:t>
+            </w:r>
+          </w:p>
+        </w:tc>
+        <w:tc>
+          <w:tcPr>
+            <w:tcBorders>
+              <w:top w:val="single" w:space="0" w:color="D3D3D3"/>
+              <w:bottom w:val="single" w:space="0" w:color="D3D3D3"/>
+              <w:start w:val="single" w:space="0" w:color="D3D3D3"/>
+              <w:end w:val="single" w:space="0" w:color="D3D3D3"/>
+            </w:tcBorders>
+          </w:tcPr>
+          <w:p>
+            <w:pPr>
+              <w:spacing w:before="0" w:after="60"/>
+              <w:keepNext/>
+              <w:jc w:val="center"/>
+            </w:pPr>
+            <w:r>
+              <w:rPr>
+                <w:rFonts w:ascii="Calibri" w:hAnsi="Calibri"/>
+                <w:sz w:val="20"/>
+              </w:rPr>
+              <w:t xml:space="default">97 (22%)</w:t>
+            </w:r>
+          </w:p>
+        </w:tc>
+        <w:tc>
+          <w:tcPr>
+            <w:tcBorders>
+              <w:top w:val="single" w:space="0" w:color="D3D3D3"/>
+              <w:bottom w:val="single" w:space="0" w:color="D3D3D3"/>
+              <w:start w:val="single" w:space="0" w:color="D3D3D3"/>
+              <w:end w:val="single" w:space="0" w:color="D3D3D3"/>
+            </w:tcBorders>
+          </w:tcPr>
+          <w:p>
+            <w:pPr>
+              <w:spacing w:before="0" w:after="60"/>
+              <w:keepNext/>
+              <w:jc w:val="center"/>
+            </w:pPr>
+            <w:r>
+              <w:rPr>
+                <w:rFonts w:ascii="Calibri" w:hAnsi="Calibri"/>
+                <w:sz w:val="20"/>
+              </w:rPr>
+              <w:t xml:space="default">84 (23%)</w:t>
+            </w:r>
+          </w:p>
+        </w:tc>
+        <w:tc>
+          <w:tcPr>
+            <w:tcBorders>
+              <w:top w:val="single" w:space="0" w:color="D3D3D3"/>
+              <w:bottom w:val="single" w:space="0" w:color="D3D3D3"/>
+              <w:start w:val="single" w:space="0" w:color="D3D3D3"/>
+              <w:end w:val="single" w:space="0" w:color="D3D3D3"/>
+            </w:tcBorders>
+          </w:tcPr>
+          <w:p>
+            <w:pPr>
+              <w:spacing w:before="0" w:after="60"/>
+              <w:keepNext/>
+              <w:jc w:val="center"/>
+            </w:pPr>
+            <w:r>
+              <w:rPr>
+                <w:rFonts w:ascii="Calibri" w:hAnsi="Calibri"/>
+                <w:sz w:val="20"/>
+              </w:rPr>
+              <w:t xml:space="default">120 (24%)</w:t>
+            </w:r>
+          </w:p>
+        </w:tc>
+        <w:tc>
+          <w:tcPr>
+            <w:tcBorders>
+              <w:top w:val="single" w:space="0" w:color="D3D3D3"/>
+              <w:bottom w:val="single" w:space="0" w:color="D3D3D3"/>
+              <w:start w:val="single" w:space="0" w:color="D3D3D3"/>
+              <w:end w:val="single" w:space="0" w:color="D3D3D3"/>
+            </w:tcBorders>
+          </w:tcPr>
+          <w:p>
+            <w:pPr>
+              <w:spacing w:before="0" w:after="60"/>
+              <w:keepNext/>
+              <w:jc w:val="center"/>
+            </w:pPr>
+            <w:r>
+              <w:rPr>
+                <w:rFonts w:ascii="Calibri" w:hAnsi="Calibri"/>
+                <w:sz w:val="20"/>
+              </w:rPr>
+              <w:t xml:space="default">66 (23%)</w:t>
             </w:r>
           </w:p>
         </w:tc>
@@ -3417,199 +3417,199 @@
                 <w:rFonts w:ascii="Calibri" w:hAnsi="Calibri"/>
                 <w:sz w:val="20"/>
               </w:rPr>
-              <w:t xml:space="default">    Less than High School</w:t>
-            </w:r>
-          </w:p>
-        </w:tc>
-        <w:tc>
-          <w:tcPr>
-            <w:tcBorders>
-              <w:top w:val="single" w:space="0" w:color="D3D3D3"/>
-              <w:bottom w:val="single" w:space="0" w:color="D3D3D3"/>
-              <w:start w:val="single" w:space="0" w:color="D3D3D3"/>
-              <w:end w:val="single" w:space="0" w:color="D3D3D3"/>
-            </w:tcBorders>
-          </w:tcPr>
-          <w:p>
-            <w:pPr>
-              <w:spacing w:before="0" w:after="60"/>
-              <w:keepNext/>
-              <w:jc w:val="center"/>
-            </w:pPr>
-            <w:r>
-              <w:rPr>
-                <w:rFonts w:ascii="Calibri" w:hAnsi="Calibri"/>
-                <w:sz w:val="20"/>
-              </w:rPr>
-              <w:t xml:space="default">80 (12%)</w:t>
-            </w:r>
-          </w:p>
-        </w:tc>
-        <w:tc>
-          <w:tcPr>
-            <w:tcBorders>
-              <w:top w:val="single" w:space="0" w:color="D3D3D3"/>
-              <w:bottom w:val="single" w:space="0" w:color="D3D3D3"/>
-              <w:start w:val="single" w:space="0" w:color="D3D3D3"/>
-              <w:end w:val="single" w:space="0" w:color="D3D3D3"/>
-            </w:tcBorders>
-          </w:tcPr>
-          <w:p>
-            <w:pPr>
-              <w:spacing w:before="0" w:after="60"/>
-              <w:keepNext/>
-              <w:jc w:val="center"/>
-            </w:pPr>
-            <w:r>
-              <w:rPr>
-                <w:rFonts w:ascii="Calibri" w:hAnsi="Calibri"/>
-                <w:sz w:val="20"/>
-              </w:rPr>
-              <w:t xml:space="default">92 (11%)</w:t>
-            </w:r>
-          </w:p>
-        </w:tc>
-        <w:tc>
-          <w:tcPr>
-            <w:tcBorders>
-              <w:top w:val="single" w:space="0" w:color="D3D3D3"/>
-              <w:bottom w:val="single" w:space="0" w:color="D3D3D3"/>
-              <w:start w:val="single" w:space="0" w:color="D3D3D3"/>
-              <w:end w:val="single" w:space="0" w:color="D3D3D3"/>
-            </w:tcBorders>
-          </w:tcPr>
-          <w:p>
-            <w:pPr>
-              <w:spacing w:before="0" w:after="60"/>
-              <w:keepNext/>
-              <w:jc w:val="center"/>
-            </w:pPr>
-            <w:r>
-              <w:rPr>
-                <w:rFonts w:ascii="Calibri" w:hAnsi="Calibri"/>
-                <w:sz w:val="20"/>
-              </w:rPr>
-              <w:t xml:space="default">130 (16%)</w:t>
-            </w:r>
-          </w:p>
-        </w:tc>
-        <w:tc>
-          <w:tcPr>
-            <w:tcBorders>
-              <w:top w:val="single" w:space="0" w:color="D3D3D3"/>
-              <w:bottom w:val="single" w:space="0" w:color="D3D3D3"/>
-              <w:start w:val="single" w:space="0" w:color="D3D3D3"/>
-              <w:end w:val="single" w:space="0" w:color="D3D3D3"/>
-            </w:tcBorders>
-          </w:tcPr>
-          <w:p>
-            <w:pPr>
-              <w:spacing w:before="0" w:after="60"/>
-              <w:keepNext/>
-              <w:jc w:val="center"/>
-            </w:pPr>
-            <w:r>
-              <w:rPr>
-                <w:rFonts w:ascii="Calibri" w:hAnsi="Calibri"/>
-                <w:sz w:val="20"/>
-              </w:rPr>
-              <w:t xml:space="default">120 (26%)</w:t>
-            </w:r>
-          </w:p>
-        </w:tc>
-        <w:tc>
-          <w:tcPr>
-            <w:tcBorders>
-              <w:top w:val="single" w:space="0" w:color="D3D3D3"/>
-              <w:bottom w:val="single" w:space="0" w:color="D3D3D3"/>
-              <w:start w:val="single" w:space="0" w:color="D3D3D3"/>
-              <w:end w:val="single" w:space="0" w:color="D3D3D3"/>
-            </w:tcBorders>
-          </w:tcPr>
-          <w:p>
-            <w:pPr>
-              <w:spacing w:before="0" w:after="60"/>
-              <w:keepNext/>
-              <w:jc w:val="center"/>
-            </w:pPr>
-            <w:r>
-              <w:rPr>
-                <w:rFonts w:ascii="Calibri" w:hAnsi="Calibri"/>
-                <w:sz w:val="20"/>
-              </w:rPr>
-              <w:t xml:space="default">106 (15%)</w:t>
-            </w:r>
-          </w:p>
-        </w:tc>
-        <w:tc>
-          <w:tcPr>
-            <w:tcBorders>
-              <w:top w:val="single" w:space="0" w:color="D3D3D3"/>
-              <w:bottom w:val="single" w:space="0" w:color="D3D3D3"/>
-              <w:start w:val="single" w:space="0" w:color="D3D3D3"/>
-              <w:end w:val="single" w:space="0" w:color="D3D3D3"/>
-            </w:tcBorders>
-          </w:tcPr>
-          <w:p>
-            <w:pPr>
-              <w:spacing w:before="0" w:after="60"/>
-              <w:keepNext/>
-              <w:jc w:val="center"/>
-            </w:pPr>
-            <w:r>
-              <w:rPr>
-                <w:rFonts w:ascii="Calibri" w:hAnsi="Calibri"/>
-                <w:sz w:val="20"/>
-              </w:rPr>
-              <w:t xml:space="default">103 (17%)</w:t>
-            </w:r>
-          </w:p>
-        </w:tc>
-        <w:tc>
-          <w:tcPr>
-            <w:tcBorders>
-              <w:top w:val="single" w:space="0" w:color="D3D3D3"/>
-              <w:bottom w:val="single" w:space="0" w:color="D3D3D3"/>
-              <w:start w:val="single" w:space="0" w:color="D3D3D3"/>
-              <w:end w:val="single" w:space="0" w:color="D3D3D3"/>
-            </w:tcBorders>
-          </w:tcPr>
-          <w:p>
-            <w:pPr>
-              <w:spacing w:before="0" w:after="60"/>
-              <w:keepNext/>
-              <w:jc w:val="center"/>
-            </w:pPr>
-            <w:r>
-              <w:rPr>
-                <w:rFonts w:ascii="Calibri" w:hAnsi="Calibri"/>
-                <w:sz w:val="20"/>
-              </w:rPr>
-              <w:t xml:space="default">140 (18%)</w:t>
-            </w:r>
-          </w:p>
-        </w:tc>
-        <w:tc>
-          <w:tcPr>
-            <w:tcBorders>
-              <w:top w:val="single" w:space="0" w:color="D3D3D3"/>
-              <w:bottom w:val="single" w:space="0" w:color="D3D3D3"/>
-              <w:start w:val="single" w:space="0" w:color="D3D3D3"/>
-              <w:end w:val="single" w:space="0" w:color="D3D3D3"/>
-            </w:tcBorders>
-          </w:tcPr>
-          <w:p>
-            <w:pPr>
-              <w:spacing w:before="0" w:after="60"/>
-              <w:keepNext/>
-              <w:jc w:val="center"/>
-            </w:pPr>
-            <w:r>
-              <w:rPr>
-                <w:rFonts w:ascii="Calibri" w:hAnsi="Calibri"/>
-                <w:sz w:val="20"/>
-              </w:rPr>
-              <w:t xml:space="default">125 (27%)</w:t>
+              <w:t xml:space="default">    High Income (&gt; 350% PIR)</w:t>
+            </w:r>
+          </w:p>
+        </w:tc>
+        <w:tc>
+          <w:tcPr>
+            <w:tcBorders>
+              <w:top w:val="single" w:space="0" w:color="D3D3D3"/>
+              <w:bottom w:val="single" w:space="0" w:color="D3D3D3"/>
+              <w:start w:val="single" w:space="0" w:color="D3D3D3"/>
+              <w:end w:val="single" w:space="0" w:color="D3D3D3"/>
+            </w:tcBorders>
+          </w:tcPr>
+          <w:p>
+            <w:pPr>
+              <w:spacing w:before="0" w:after="60"/>
+              <w:keepNext/>
+              <w:jc w:val="center"/>
+            </w:pPr>
+            <w:r>
+              <w:rPr>
+                <w:rFonts w:ascii="Calibri" w:hAnsi="Calibri"/>
+                <w:sz w:val="20"/>
+              </w:rPr>
+              <w:t xml:space="default">122 (34%)</w:t>
+            </w:r>
+          </w:p>
+        </w:tc>
+        <w:tc>
+          <w:tcPr>
+            <w:tcBorders>
+              <w:top w:val="single" w:space="0" w:color="D3D3D3"/>
+              <w:bottom w:val="single" w:space="0" w:color="D3D3D3"/>
+              <w:start w:val="single" w:space="0" w:color="D3D3D3"/>
+              <w:end w:val="single" w:space="0" w:color="D3D3D3"/>
+            </w:tcBorders>
+          </w:tcPr>
+          <w:p>
+            <w:pPr>
+              <w:spacing w:before="0" w:after="60"/>
+              <w:keepNext/>
+              <w:jc w:val="center"/>
+            </w:pPr>
+            <w:r>
+              <w:rPr>
+                <w:rFonts w:ascii="Calibri" w:hAnsi="Calibri"/>
+                <w:sz w:val="20"/>
+              </w:rPr>
+              <w:t xml:space="default">124 (34%)</w:t>
+            </w:r>
+          </w:p>
+        </w:tc>
+        <w:tc>
+          <w:tcPr>
+            <w:tcBorders>
+              <w:top w:val="single" w:space="0" w:color="D3D3D3"/>
+              <w:bottom w:val="single" w:space="0" w:color="D3D3D3"/>
+              <w:start w:val="single" w:space="0" w:color="D3D3D3"/>
+              <w:end w:val="single" w:space="0" w:color="D3D3D3"/>
+            </w:tcBorders>
+          </w:tcPr>
+          <w:p>
+            <w:pPr>
+              <w:spacing w:before="0" w:after="60"/>
+              <w:keepNext/>
+              <w:jc w:val="center"/>
+            </w:pPr>
+            <w:r>
+              <w:rPr>
+                <w:rFonts w:ascii="Calibri" w:hAnsi="Calibri"/>
+                <w:sz w:val="20"/>
+              </w:rPr>
+              <w:t xml:space="default">122 (27%)</w:t>
+            </w:r>
+          </w:p>
+        </w:tc>
+        <w:tc>
+          <w:tcPr>
+            <w:tcBorders>
+              <w:top w:val="single" w:space="0" w:color="D3D3D3"/>
+              <w:bottom w:val="single" w:space="0" w:color="D3D3D3"/>
+              <w:start w:val="single" w:space="0" w:color="D3D3D3"/>
+              <w:end w:val="single" w:space="0" w:color="D3D3D3"/>
+            </w:tcBorders>
+          </w:tcPr>
+          <w:p>
+            <w:pPr>
+              <w:spacing w:before="0" w:after="60"/>
+              <w:keepNext/>
+              <w:jc w:val="center"/>
+            </w:pPr>
+            <w:r>
+              <w:rPr>
+                <w:rFonts w:ascii="Calibri" w:hAnsi="Calibri"/>
+                <w:sz w:val="20"/>
+              </w:rPr>
+              <w:t xml:space="default">50 (19%)</w:t>
+            </w:r>
+          </w:p>
+        </w:tc>
+        <w:tc>
+          <w:tcPr>
+            <w:tcBorders>
+              <w:top w:val="single" w:space="0" w:color="D3D3D3"/>
+              <w:bottom w:val="single" w:space="0" w:color="D3D3D3"/>
+              <w:start w:val="single" w:space="0" w:color="D3D3D3"/>
+              <w:end w:val="single" w:space="0" w:color="D3D3D3"/>
+            </w:tcBorders>
+          </w:tcPr>
+          <w:p>
+            <w:pPr>
+              <w:spacing w:before="0" w:after="60"/>
+              <w:keepNext/>
+              <w:jc w:val="center"/>
+            </w:pPr>
+            <w:r>
+              <w:rPr>
+                <w:rFonts w:ascii="Calibri" w:hAnsi="Calibri"/>
+                <w:sz w:val="20"/>
+              </w:rPr>
+              <w:t xml:space="default">141 (40%)</w:t>
+            </w:r>
+          </w:p>
+        </w:tc>
+        <w:tc>
+          <w:tcPr>
+            <w:tcBorders>
+              <w:top w:val="single" w:space="0" w:color="D3D3D3"/>
+              <w:bottom w:val="single" w:space="0" w:color="D3D3D3"/>
+              <w:start w:val="single" w:space="0" w:color="D3D3D3"/>
+              <w:end w:val="single" w:space="0" w:color="D3D3D3"/>
+            </w:tcBorders>
+          </w:tcPr>
+          <w:p>
+            <w:pPr>
+              <w:spacing w:before="0" w:after="60"/>
+              <w:keepNext/>
+              <w:jc w:val="center"/>
+            </w:pPr>
+            <w:r>
+              <w:rPr>
+                <w:rFonts w:ascii="Calibri" w:hAnsi="Calibri"/>
+                <w:sz w:val="20"/>
+              </w:rPr>
+              <w:t xml:space="default">94 (31%)</w:t>
+            </w:r>
+          </w:p>
+        </w:tc>
+        <w:tc>
+          <w:tcPr>
+            <w:tcBorders>
+              <w:top w:val="single" w:space="0" w:color="D3D3D3"/>
+              <w:bottom w:val="single" w:space="0" w:color="D3D3D3"/>
+              <w:start w:val="single" w:space="0" w:color="D3D3D3"/>
+              <w:end w:val="single" w:space="0" w:color="D3D3D3"/>
+            </w:tcBorders>
+          </w:tcPr>
+          <w:p>
+            <w:pPr>
+              <w:spacing w:before="0" w:after="60"/>
+              <w:keepNext/>
+              <w:jc w:val="center"/>
+            </w:pPr>
+            <w:r>
+              <w:rPr>
+                <w:rFonts w:ascii="Calibri" w:hAnsi="Calibri"/>
+                <w:sz w:val="20"/>
+              </w:rPr>
+              <w:t xml:space="default">114 (31%)</w:t>
+            </w:r>
+          </w:p>
+        </w:tc>
+        <w:tc>
+          <w:tcPr>
+            <w:tcBorders>
+              <w:top w:val="single" w:space="0" w:color="D3D3D3"/>
+              <w:bottom w:val="single" w:space="0" w:color="D3D3D3"/>
+              <w:start w:val="single" w:space="0" w:color="D3D3D3"/>
+              <w:end w:val="single" w:space="0" w:color="D3D3D3"/>
+            </w:tcBorders>
+          </w:tcPr>
+          <w:p>
+            <w:pPr>
+              <w:spacing w:before="0" w:after="60"/>
+              <w:keepNext/>
+              <w:jc w:val="center"/>
+            </w:pPr>
+            <w:r>
+              <w:rPr>
+                <w:rFonts w:ascii="Calibri" w:hAnsi="Calibri"/>
+                <w:sz w:val="20"/>
+              </w:rPr>
+              <w:t xml:space="default">61 (22%)</w:t>
             </w:r>
           </w:p>
         </w:tc>
@@ -3638,199 +3638,199 @@
                 <w:rFonts w:ascii="Calibri" w:hAnsi="Calibri"/>
                 <w:sz w:val="20"/>
               </w:rPr>
-              <w:t xml:space="default">    High School / Some College</w:t>
-            </w:r>
-          </w:p>
-        </w:tc>
-        <w:tc>
-          <w:tcPr>
-            <w:tcBorders>
-              <w:top w:val="single" w:space="0" w:color="D3D3D3"/>
-              <w:bottom w:val="single" w:space="0" w:color="D3D3D3"/>
-              <w:start w:val="single" w:space="0" w:color="D3D3D3"/>
-              <w:end w:val="single" w:space="0" w:color="D3D3D3"/>
-            </w:tcBorders>
-          </w:tcPr>
-          <w:p>
-            <w:pPr>
-              <w:spacing w:before="0" w:after="60"/>
-              <w:keepNext/>
-              <w:jc w:val="center"/>
-            </w:pPr>
-            <w:r>
-              <w:rPr>
-                <w:rFonts w:ascii="Calibri" w:hAnsi="Calibri"/>
-                <w:sz w:val="20"/>
-              </w:rPr>
-              <w:t xml:space="default">261 (55%)</w:t>
-            </w:r>
-          </w:p>
-        </w:tc>
-        <w:tc>
-          <w:tcPr>
-            <w:tcBorders>
-              <w:top w:val="single" w:space="0" w:color="D3D3D3"/>
-              <w:bottom w:val="single" w:space="0" w:color="D3D3D3"/>
-              <w:start w:val="single" w:space="0" w:color="D3D3D3"/>
-              <w:end w:val="single" w:space="0" w:color="D3D3D3"/>
-            </w:tcBorders>
-          </w:tcPr>
-          <w:p>
-            <w:pPr>
-              <w:spacing w:before="0" w:after="60"/>
-              <w:keepNext/>
-              <w:jc w:val="center"/>
-            </w:pPr>
-            <w:r>
-              <w:rPr>
-                <w:rFonts w:ascii="Calibri" w:hAnsi="Calibri"/>
-                <w:sz w:val="20"/>
-              </w:rPr>
-              <w:t xml:space="default">342 (59%)</w:t>
-            </w:r>
-          </w:p>
-        </w:tc>
-        <w:tc>
-          <w:tcPr>
-            <w:tcBorders>
-              <w:top w:val="single" w:space="0" w:color="D3D3D3"/>
-              <w:bottom w:val="single" w:space="0" w:color="D3D3D3"/>
-              <w:start w:val="single" w:space="0" w:color="D3D3D3"/>
-              <w:end w:val="single" w:space="0" w:color="D3D3D3"/>
-            </w:tcBorders>
-          </w:tcPr>
-          <w:p>
-            <w:pPr>
-              <w:spacing w:before="0" w:after="60"/>
-              <w:keepNext/>
-              <w:jc w:val="center"/>
-            </w:pPr>
-            <w:r>
-              <w:rPr>
-                <w:rFonts w:ascii="Calibri" w:hAnsi="Calibri"/>
-                <w:sz w:val="20"/>
-              </w:rPr>
-              <w:t xml:space="default">359 (59%)</w:t>
-            </w:r>
-          </w:p>
-        </w:tc>
-        <w:tc>
-          <w:tcPr>
-            <w:tcBorders>
-              <w:top w:val="single" w:space="0" w:color="D3D3D3"/>
-              <w:bottom w:val="single" w:space="0" w:color="D3D3D3"/>
-              <w:start w:val="single" w:space="0" w:color="D3D3D3"/>
-              <w:end w:val="single" w:space="0" w:color="D3D3D3"/>
-            </w:tcBorders>
-          </w:tcPr>
-          <w:p>
-            <w:pPr>
-              <w:spacing w:before="0" w:after="60"/>
-              <w:keepNext/>
-              <w:jc w:val="center"/>
-            </w:pPr>
-            <w:r>
-              <w:rPr>
-                <w:rFonts w:ascii="Calibri" w:hAnsi="Calibri"/>
-                <w:sz w:val="20"/>
-              </w:rPr>
-              <w:t xml:space="default">220 (55%)</w:t>
-            </w:r>
-          </w:p>
-        </w:tc>
-        <w:tc>
-          <w:tcPr>
-            <w:tcBorders>
-              <w:top w:val="single" w:space="0" w:color="D3D3D3"/>
-              <w:bottom w:val="single" w:space="0" w:color="D3D3D3"/>
-              <w:start w:val="single" w:space="0" w:color="D3D3D3"/>
-              <w:end w:val="single" w:space="0" w:color="D3D3D3"/>
-            </w:tcBorders>
-          </w:tcPr>
-          <w:p>
-            <w:pPr>
-              <w:spacing w:before="0" w:after="60"/>
-              <w:keepNext/>
-              <w:jc w:val="center"/>
-            </w:pPr>
-            <w:r>
-              <w:rPr>
-                <w:rFonts w:ascii="Calibri" w:hAnsi="Calibri"/>
-                <w:sz w:val="20"/>
-              </w:rPr>
-              <w:t xml:space="default">230 (42%)</w:t>
-            </w:r>
-          </w:p>
-        </w:tc>
-        <w:tc>
-          <w:tcPr>
-            <w:tcBorders>
-              <w:top w:val="single" w:space="0" w:color="D3D3D3"/>
-              <w:bottom w:val="single" w:space="0" w:color="D3D3D3"/>
-              <w:start w:val="single" w:space="0" w:color="D3D3D3"/>
-              <w:end w:val="single" w:space="0" w:color="D3D3D3"/>
-            </w:tcBorders>
-          </w:tcPr>
-          <w:p>
-            <w:pPr>
-              <w:spacing w:before="0" w:after="60"/>
-              <w:keepNext/>
-              <w:jc w:val="center"/>
-            </w:pPr>
-            <w:r>
-              <w:rPr>
-                <w:rFonts w:ascii="Calibri" w:hAnsi="Calibri"/>
-                <w:sz w:val="20"/>
-              </w:rPr>
-              <w:t xml:space="default">256 (56%)</w:t>
-            </w:r>
-          </w:p>
-        </w:tc>
-        <w:tc>
-          <w:tcPr>
-            <w:tcBorders>
-              <w:top w:val="single" w:space="0" w:color="D3D3D3"/>
-              <w:bottom w:val="single" w:space="0" w:color="D3D3D3"/>
-              <w:start w:val="single" w:space="0" w:color="D3D3D3"/>
-              <w:end w:val="single" w:space="0" w:color="D3D3D3"/>
-            </w:tcBorders>
-          </w:tcPr>
-          <w:p>
-            <w:pPr>
-              <w:spacing w:before="0" w:after="60"/>
-              <w:keepNext/>
-              <w:jc w:val="center"/>
-            </w:pPr>
-            <w:r>
-              <w:rPr>
-                <w:rFonts w:ascii="Calibri" w:hAnsi="Calibri"/>
-                <w:sz w:val="20"/>
-              </w:rPr>
-              <w:t xml:space="default">312 (54%)</w:t>
-            </w:r>
-          </w:p>
-        </w:tc>
-        <w:tc>
-          <w:tcPr>
-            <w:tcBorders>
-              <w:top w:val="single" w:space="0" w:color="D3D3D3"/>
-              <w:bottom w:val="single" w:space="0" w:color="D3D3D3"/>
-              <w:start w:val="single" w:space="0" w:color="D3D3D3"/>
-              <w:end w:val="single" w:space="0" w:color="D3D3D3"/>
-            </w:tcBorders>
-          </w:tcPr>
-          <w:p>
-            <w:pPr>
-              <w:spacing w:before="0" w:after="60"/>
-              <w:keepNext/>
-              <w:jc w:val="center"/>
-            </w:pPr>
-            <w:r>
-              <w:rPr>
-                <w:rFonts w:ascii="Calibri" w:hAnsi="Calibri"/>
-                <w:sz w:val="20"/>
-              </w:rPr>
-              <w:t xml:space="default">213 (51%)</w:t>
+              <w:t xml:space="default">Parent Education</w:t>
+            </w:r>
+          </w:p>
+        </w:tc>
+        <w:tc>
+          <w:tcPr>
+            <w:tcBorders>
+              <w:top w:val="single" w:space="0" w:color="D3D3D3"/>
+              <w:bottom w:val="single" w:space="0" w:color="D3D3D3"/>
+              <w:start w:val="single" w:space="0" w:color="D3D3D3"/>
+              <w:end w:val="single" w:space="0" w:color="D3D3D3"/>
+            </w:tcBorders>
+          </w:tcPr>
+          <w:p>
+            <w:pPr>
+              <w:spacing w:before="0" w:after="60"/>
+              <w:keepNext/>
+              <w:jc w:val="center"/>
+            </w:pPr>
+            <w:r>
+              <w:rPr>
+                <w:rFonts w:ascii="Calibri" w:hAnsi="Calibri"/>
+                <w:sz w:val="20"/>
+              </w:rPr>
+              <w:t xml:space="default"/>
+            </w:r>
+          </w:p>
+        </w:tc>
+        <w:tc>
+          <w:tcPr>
+            <w:tcBorders>
+              <w:top w:val="single" w:space="0" w:color="D3D3D3"/>
+              <w:bottom w:val="single" w:space="0" w:color="D3D3D3"/>
+              <w:start w:val="single" w:space="0" w:color="D3D3D3"/>
+              <w:end w:val="single" w:space="0" w:color="D3D3D3"/>
+            </w:tcBorders>
+          </w:tcPr>
+          <w:p>
+            <w:pPr>
+              <w:spacing w:before="0" w:after="60"/>
+              <w:keepNext/>
+              <w:jc w:val="center"/>
+            </w:pPr>
+            <w:r>
+              <w:rPr>
+                <w:rFonts w:ascii="Calibri" w:hAnsi="Calibri"/>
+                <w:sz w:val="20"/>
+              </w:rPr>
+              <w:t xml:space="default"/>
+            </w:r>
+          </w:p>
+        </w:tc>
+        <w:tc>
+          <w:tcPr>
+            <w:tcBorders>
+              <w:top w:val="single" w:space="0" w:color="D3D3D3"/>
+              <w:bottom w:val="single" w:space="0" w:color="D3D3D3"/>
+              <w:start w:val="single" w:space="0" w:color="D3D3D3"/>
+              <w:end w:val="single" w:space="0" w:color="D3D3D3"/>
+            </w:tcBorders>
+          </w:tcPr>
+          <w:p>
+            <w:pPr>
+              <w:spacing w:before="0" w:after="60"/>
+              <w:keepNext/>
+              <w:jc w:val="center"/>
+            </w:pPr>
+            <w:r>
+              <w:rPr>
+                <w:rFonts w:ascii="Calibri" w:hAnsi="Calibri"/>
+                <w:sz w:val="20"/>
+              </w:rPr>
+              <w:t xml:space="default"/>
+            </w:r>
+          </w:p>
+        </w:tc>
+        <w:tc>
+          <w:tcPr>
+            <w:tcBorders>
+              <w:top w:val="single" w:space="0" w:color="D3D3D3"/>
+              <w:bottom w:val="single" w:space="0" w:color="D3D3D3"/>
+              <w:start w:val="single" w:space="0" w:color="D3D3D3"/>
+              <w:end w:val="single" w:space="0" w:color="D3D3D3"/>
+            </w:tcBorders>
+          </w:tcPr>
+          <w:p>
+            <w:pPr>
+              <w:spacing w:before="0" w:after="60"/>
+              <w:keepNext/>
+              <w:jc w:val="center"/>
+            </w:pPr>
+            <w:r>
+              <w:rPr>
+                <w:rFonts w:ascii="Calibri" w:hAnsi="Calibri"/>
+                <w:sz w:val="20"/>
+              </w:rPr>
+              <w:t xml:space="default"/>
+            </w:r>
+          </w:p>
+        </w:tc>
+        <w:tc>
+          <w:tcPr>
+            <w:tcBorders>
+              <w:top w:val="single" w:space="0" w:color="D3D3D3"/>
+              <w:bottom w:val="single" w:space="0" w:color="D3D3D3"/>
+              <w:start w:val="single" w:space="0" w:color="D3D3D3"/>
+              <w:end w:val="single" w:space="0" w:color="D3D3D3"/>
+            </w:tcBorders>
+          </w:tcPr>
+          <w:p>
+            <w:pPr>
+              <w:spacing w:before="0" w:after="60"/>
+              <w:keepNext/>
+              <w:jc w:val="center"/>
+            </w:pPr>
+            <w:r>
+              <w:rPr>
+                <w:rFonts w:ascii="Calibri" w:hAnsi="Calibri"/>
+                <w:sz w:val="20"/>
+              </w:rPr>
+              <w:t xml:space="default"/>
+            </w:r>
+          </w:p>
+        </w:tc>
+        <w:tc>
+          <w:tcPr>
+            <w:tcBorders>
+              <w:top w:val="single" w:space="0" w:color="D3D3D3"/>
+              <w:bottom w:val="single" w:space="0" w:color="D3D3D3"/>
+              <w:start w:val="single" w:space="0" w:color="D3D3D3"/>
+              <w:end w:val="single" w:space="0" w:color="D3D3D3"/>
+            </w:tcBorders>
+          </w:tcPr>
+          <w:p>
+            <w:pPr>
+              <w:spacing w:before="0" w:after="60"/>
+              <w:keepNext/>
+              <w:jc w:val="center"/>
+            </w:pPr>
+            <w:r>
+              <w:rPr>
+                <w:rFonts w:ascii="Calibri" w:hAnsi="Calibri"/>
+                <w:sz w:val="20"/>
+              </w:rPr>
+              <w:t xml:space="default"/>
+            </w:r>
+          </w:p>
+        </w:tc>
+        <w:tc>
+          <w:tcPr>
+            <w:tcBorders>
+              <w:top w:val="single" w:space="0" w:color="D3D3D3"/>
+              <w:bottom w:val="single" w:space="0" w:color="D3D3D3"/>
+              <w:start w:val="single" w:space="0" w:color="D3D3D3"/>
+              <w:end w:val="single" w:space="0" w:color="D3D3D3"/>
+            </w:tcBorders>
+          </w:tcPr>
+          <w:p>
+            <w:pPr>
+              <w:spacing w:before="0" w:after="60"/>
+              <w:keepNext/>
+              <w:jc w:val="center"/>
+            </w:pPr>
+            <w:r>
+              <w:rPr>
+                <w:rFonts w:ascii="Calibri" w:hAnsi="Calibri"/>
+                <w:sz w:val="20"/>
+              </w:rPr>
+              <w:t xml:space="default"/>
+            </w:r>
+          </w:p>
+        </w:tc>
+        <w:tc>
+          <w:tcPr>
+            <w:tcBorders>
+              <w:top w:val="single" w:space="0" w:color="D3D3D3"/>
+              <w:bottom w:val="single" w:space="0" w:color="D3D3D3"/>
+              <w:start w:val="single" w:space="0" w:color="D3D3D3"/>
+              <w:end w:val="single" w:space="0" w:color="D3D3D3"/>
+            </w:tcBorders>
+          </w:tcPr>
+          <w:p>
+            <w:pPr>
+              <w:spacing w:before="0" w:after="60"/>
+              <w:keepNext/>
+              <w:jc w:val="center"/>
+            </w:pPr>
+            <w:r>
+              <w:rPr>
+                <w:rFonts w:ascii="Calibri" w:hAnsi="Calibri"/>
+                <w:sz w:val="20"/>
+              </w:rPr>
+              <w:t xml:space="default"/>
             </w:r>
           </w:p>
         </w:tc>
@@ -3859,199 +3859,199 @@
                 <w:rFonts w:ascii="Calibri" w:hAnsi="Calibri"/>
                 <w:sz w:val="20"/>
               </w:rPr>
-              <w:t xml:space="default">    College Grad or Above</w:t>
-            </w:r>
-          </w:p>
-        </w:tc>
-        <w:tc>
-          <w:tcPr>
-            <w:tcBorders>
-              <w:top w:val="single" w:space="0" w:color="D3D3D3"/>
-              <w:bottom w:val="single" w:space="0" w:color="D3D3D3"/>
-              <w:start w:val="single" w:space="0" w:color="D3D3D3"/>
-              <w:end w:val="single" w:space="0" w:color="D3D3D3"/>
-            </w:tcBorders>
-          </w:tcPr>
-          <w:p>
-            <w:pPr>
-              <w:spacing w:before="0" w:after="60"/>
-              <w:keepNext/>
-              <w:jc w:val="center"/>
-            </w:pPr>
-            <w:r>
-              <w:rPr>
-                <w:rFonts w:ascii="Calibri" w:hAnsi="Calibri"/>
-                <w:sz w:val="20"/>
-              </w:rPr>
-              <w:t xml:space="default">126 (33%)</w:t>
-            </w:r>
-          </w:p>
-        </w:tc>
-        <w:tc>
-          <w:tcPr>
-            <w:tcBorders>
-              <w:top w:val="single" w:space="0" w:color="D3D3D3"/>
-              <w:bottom w:val="single" w:space="0" w:color="D3D3D3"/>
-              <w:start w:val="single" w:space="0" w:color="D3D3D3"/>
-              <w:end w:val="single" w:space="0" w:color="D3D3D3"/>
-            </w:tcBorders>
-          </w:tcPr>
-          <w:p>
-            <w:pPr>
-              <w:spacing w:before="0" w:after="60"/>
-              <w:keepNext/>
-              <w:jc w:val="center"/>
-            </w:pPr>
-            <w:r>
-              <w:rPr>
-                <w:rFonts w:ascii="Calibri" w:hAnsi="Calibri"/>
-                <w:sz w:val="20"/>
-              </w:rPr>
-              <w:t xml:space="default">118 (30%)</w:t>
-            </w:r>
-          </w:p>
-        </w:tc>
-        <w:tc>
-          <w:tcPr>
-            <w:tcBorders>
-              <w:top w:val="single" w:space="0" w:color="D3D3D3"/>
-              <w:bottom w:val="single" w:space="0" w:color="D3D3D3"/>
-              <w:start w:val="single" w:space="0" w:color="D3D3D3"/>
-              <w:end w:val="single" w:space="0" w:color="D3D3D3"/>
-            </w:tcBorders>
-          </w:tcPr>
-          <w:p>
-            <w:pPr>
-              <w:spacing w:before="0" w:after="60"/>
-              <w:keepNext/>
-              <w:jc w:val="center"/>
-            </w:pPr>
-            <w:r>
-              <w:rPr>
-                <w:rFonts w:ascii="Calibri" w:hAnsi="Calibri"/>
-                <w:sz w:val="20"/>
-              </w:rPr>
-              <w:t xml:space="default">134 (25%)</w:t>
-            </w:r>
-          </w:p>
-        </w:tc>
-        <w:tc>
-          <w:tcPr>
-            <w:tcBorders>
-              <w:top w:val="single" w:space="0" w:color="D3D3D3"/>
-              <w:bottom w:val="single" w:space="0" w:color="D3D3D3"/>
-              <w:start w:val="single" w:space="0" w:color="D3D3D3"/>
-              <w:end w:val="single" w:space="0" w:color="D3D3D3"/>
-            </w:tcBorders>
-          </w:tcPr>
-          <w:p>
-            <w:pPr>
-              <w:spacing w:before="0" w:after="60"/>
-              <w:keepNext/>
-              <w:jc w:val="center"/>
-            </w:pPr>
-            <w:r>
-              <w:rPr>
-                <w:rFonts w:ascii="Calibri" w:hAnsi="Calibri"/>
-                <w:sz w:val="20"/>
-              </w:rPr>
-              <w:t xml:space="default">62 (20%)</w:t>
-            </w:r>
-          </w:p>
-        </w:tc>
-        <w:tc>
-          <w:tcPr>
-            <w:tcBorders>
-              <w:top w:val="single" w:space="0" w:color="D3D3D3"/>
-              <w:bottom w:val="single" w:space="0" w:color="D3D3D3"/>
-              <w:start w:val="single" w:space="0" w:color="D3D3D3"/>
-              <w:end w:val="single" w:space="0" w:color="D3D3D3"/>
-            </w:tcBorders>
-          </w:tcPr>
-          <w:p>
-            <w:pPr>
-              <w:spacing w:before="0" w:after="60"/>
-              <w:keepNext/>
-              <w:jc w:val="center"/>
-            </w:pPr>
-            <w:r>
-              <w:rPr>
-                <w:rFonts w:ascii="Calibri" w:hAnsi="Calibri"/>
-                <w:sz w:val="20"/>
-              </w:rPr>
-              <w:t xml:space="default">175 (43%)</w:t>
-            </w:r>
-          </w:p>
-        </w:tc>
-        <w:tc>
-          <w:tcPr>
-            <w:tcBorders>
-              <w:top w:val="single" w:space="0" w:color="D3D3D3"/>
-              <w:bottom w:val="single" w:space="0" w:color="D3D3D3"/>
-              <w:start w:val="single" w:space="0" w:color="D3D3D3"/>
-              <w:end w:val="single" w:space="0" w:color="D3D3D3"/>
-            </w:tcBorders>
-          </w:tcPr>
-          <w:p>
-            <w:pPr>
-              <w:spacing w:before="0" w:after="60"/>
-              <w:keepNext/>
-              <w:jc w:val="center"/>
-            </w:pPr>
-            <w:r>
-              <w:rPr>
-                <w:rFonts w:ascii="Calibri" w:hAnsi="Calibri"/>
-                <w:sz w:val="20"/>
-              </w:rPr>
-              <w:t xml:space="default">98 (28%)</w:t>
-            </w:r>
-          </w:p>
-        </w:tc>
-        <w:tc>
-          <w:tcPr>
-            <w:tcBorders>
-              <w:top w:val="single" w:space="0" w:color="D3D3D3"/>
-              <w:bottom w:val="single" w:space="0" w:color="D3D3D3"/>
-              <w:start w:val="single" w:space="0" w:color="D3D3D3"/>
-              <w:end w:val="single" w:space="0" w:color="D3D3D3"/>
-            </w:tcBorders>
-          </w:tcPr>
-          <w:p>
-            <w:pPr>
-              <w:spacing w:before="0" w:after="60"/>
-              <w:keepNext/>
-              <w:jc w:val="center"/>
-            </w:pPr>
-            <w:r>
-              <w:rPr>
-                <w:rFonts w:ascii="Calibri" w:hAnsi="Calibri"/>
-                <w:sz w:val="20"/>
-              </w:rPr>
-              <w:t xml:space="default">125 (29%)</w:t>
-            </w:r>
-          </w:p>
-        </w:tc>
-        <w:tc>
-          <w:tcPr>
-            <w:tcBorders>
-              <w:top w:val="single" w:space="0" w:color="D3D3D3"/>
-              <w:bottom w:val="single" w:space="0" w:color="D3D3D3"/>
-              <w:start w:val="single" w:space="0" w:color="D3D3D3"/>
-              <w:end w:val="single" w:space="0" w:color="D3D3D3"/>
-            </w:tcBorders>
-          </w:tcPr>
-          <w:p>
-            <w:pPr>
-              <w:spacing w:before="0" w:after="60"/>
-              <w:keepNext/>
-              <w:jc w:val="center"/>
-            </w:pPr>
-            <w:r>
-              <w:rPr>
-                <w:rFonts w:ascii="Calibri" w:hAnsi="Calibri"/>
-                <w:sz w:val="20"/>
-              </w:rPr>
-              <w:t xml:space="default">70 (23%)</w:t>
+              <w:t xml:space="default">    Less than High School</w:t>
+            </w:r>
+          </w:p>
+        </w:tc>
+        <w:tc>
+          <w:tcPr>
+            <w:tcBorders>
+              <w:top w:val="single" w:space="0" w:color="D3D3D3"/>
+              <w:bottom w:val="single" w:space="0" w:color="D3D3D3"/>
+              <w:start w:val="single" w:space="0" w:color="D3D3D3"/>
+              <w:end w:val="single" w:space="0" w:color="D3D3D3"/>
+            </w:tcBorders>
+          </w:tcPr>
+          <w:p>
+            <w:pPr>
+              <w:spacing w:before="0" w:after="60"/>
+              <w:keepNext/>
+              <w:jc w:val="center"/>
+            </w:pPr>
+            <w:r>
+              <w:rPr>
+                <w:rFonts w:ascii="Calibri" w:hAnsi="Calibri"/>
+                <w:sz w:val="20"/>
+              </w:rPr>
+              <w:t xml:space="default">80 (12%)</w:t>
+            </w:r>
+          </w:p>
+        </w:tc>
+        <w:tc>
+          <w:tcPr>
+            <w:tcBorders>
+              <w:top w:val="single" w:space="0" w:color="D3D3D3"/>
+              <w:bottom w:val="single" w:space="0" w:color="D3D3D3"/>
+              <w:start w:val="single" w:space="0" w:color="D3D3D3"/>
+              <w:end w:val="single" w:space="0" w:color="D3D3D3"/>
+            </w:tcBorders>
+          </w:tcPr>
+          <w:p>
+            <w:pPr>
+              <w:spacing w:before="0" w:after="60"/>
+              <w:keepNext/>
+              <w:jc w:val="center"/>
+            </w:pPr>
+            <w:r>
+              <w:rPr>
+                <w:rFonts w:ascii="Calibri" w:hAnsi="Calibri"/>
+                <w:sz w:val="20"/>
+              </w:rPr>
+              <w:t xml:space="default">92 (11%)</w:t>
+            </w:r>
+          </w:p>
+        </w:tc>
+        <w:tc>
+          <w:tcPr>
+            <w:tcBorders>
+              <w:top w:val="single" w:space="0" w:color="D3D3D3"/>
+              <w:bottom w:val="single" w:space="0" w:color="D3D3D3"/>
+              <w:start w:val="single" w:space="0" w:color="D3D3D3"/>
+              <w:end w:val="single" w:space="0" w:color="D3D3D3"/>
+            </w:tcBorders>
+          </w:tcPr>
+          <w:p>
+            <w:pPr>
+              <w:spacing w:before="0" w:after="60"/>
+              <w:keepNext/>
+              <w:jc w:val="center"/>
+            </w:pPr>
+            <w:r>
+              <w:rPr>
+                <w:rFonts w:ascii="Calibri" w:hAnsi="Calibri"/>
+                <w:sz w:val="20"/>
+              </w:rPr>
+              <w:t xml:space="default">130 (16%)</w:t>
+            </w:r>
+          </w:p>
+        </w:tc>
+        <w:tc>
+          <w:tcPr>
+            <w:tcBorders>
+              <w:top w:val="single" w:space="0" w:color="D3D3D3"/>
+              <w:bottom w:val="single" w:space="0" w:color="D3D3D3"/>
+              <w:start w:val="single" w:space="0" w:color="D3D3D3"/>
+              <w:end w:val="single" w:space="0" w:color="D3D3D3"/>
+            </w:tcBorders>
+          </w:tcPr>
+          <w:p>
+            <w:pPr>
+              <w:spacing w:before="0" w:after="60"/>
+              <w:keepNext/>
+              <w:jc w:val="center"/>
+            </w:pPr>
+            <w:r>
+              <w:rPr>
+                <w:rFonts w:ascii="Calibri" w:hAnsi="Calibri"/>
+                <w:sz w:val="20"/>
+              </w:rPr>
+              <w:t xml:space="default">120 (26%)</w:t>
+            </w:r>
+          </w:p>
+        </w:tc>
+        <w:tc>
+          <w:tcPr>
+            <w:tcBorders>
+              <w:top w:val="single" w:space="0" w:color="D3D3D3"/>
+              <w:bottom w:val="single" w:space="0" w:color="D3D3D3"/>
+              <w:start w:val="single" w:space="0" w:color="D3D3D3"/>
+              <w:end w:val="single" w:space="0" w:color="D3D3D3"/>
+            </w:tcBorders>
+          </w:tcPr>
+          <w:p>
+            <w:pPr>
+              <w:spacing w:before="0" w:after="60"/>
+              <w:keepNext/>
+              <w:jc w:val="center"/>
+            </w:pPr>
+            <w:r>
+              <w:rPr>
+                <w:rFonts w:ascii="Calibri" w:hAnsi="Calibri"/>
+                <w:sz w:val="20"/>
+              </w:rPr>
+              <w:t xml:space="default">106 (15%)</w:t>
+            </w:r>
+          </w:p>
+        </w:tc>
+        <w:tc>
+          <w:tcPr>
+            <w:tcBorders>
+              <w:top w:val="single" w:space="0" w:color="D3D3D3"/>
+              <w:bottom w:val="single" w:space="0" w:color="D3D3D3"/>
+              <w:start w:val="single" w:space="0" w:color="D3D3D3"/>
+              <w:end w:val="single" w:space="0" w:color="D3D3D3"/>
+            </w:tcBorders>
+          </w:tcPr>
+          <w:p>
+            <w:pPr>
+              <w:spacing w:before="0" w:after="60"/>
+              <w:keepNext/>
+              <w:jc w:val="center"/>
+            </w:pPr>
+            <w:r>
+              <w:rPr>
+                <w:rFonts w:ascii="Calibri" w:hAnsi="Calibri"/>
+                <w:sz w:val="20"/>
+              </w:rPr>
+              <w:t xml:space="default">103 (17%)</w:t>
+            </w:r>
+          </w:p>
+        </w:tc>
+        <w:tc>
+          <w:tcPr>
+            <w:tcBorders>
+              <w:top w:val="single" w:space="0" w:color="D3D3D3"/>
+              <w:bottom w:val="single" w:space="0" w:color="D3D3D3"/>
+              <w:start w:val="single" w:space="0" w:color="D3D3D3"/>
+              <w:end w:val="single" w:space="0" w:color="D3D3D3"/>
+            </w:tcBorders>
+          </w:tcPr>
+          <w:p>
+            <w:pPr>
+              <w:spacing w:before="0" w:after="60"/>
+              <w:keepNext/>
+              <w:jc w:val="center"/>
+            </w:pPr>
+            <w:r>
+              <w:rPr>
+                <w:rFonts w:ascii="Calibri" w:hAnsi="Calibri"/>
+                <w:sz w:val="20"/>
+              </w:rPr>
+              <w:t xml:space="default">140 (18%)</w:t>
+            </w:r>
+          </w:p>
+        </w:tc>
+        <w:tc>
+          <w:tcPr>
+            <w:tcBorders>
+              <w:top w:val="single" w:space="0" w:color="D3D3D3"/>
+              <w:bottom w:val="single" w:space="0" w:color="D3D3D3"/>
+              <w:start w:val="single" w:space="0" w:color="D3D3D3"/>
+              <w:end w:val="single" w:space="0" w:color="D3D3D3"/>
+            </w:tcBorders>
+          </w:tcPr>
+          <w:p>
+            <w:pPr>
+              <w:spacing w:before="0" w:after="60"/>
+              <w:keepNext/>
+              <w:jc w:val="center"/>
+            </w:pPr>
+            <w:r>
+              <w:rPr>
+                <w:rFonts w:ascii="Calibri" w:hAnsi="Calibri"/>
+                <w:sz w:val="20"/>
+              </w:rPr>
+              <w:t xml:space="default">125 (27%)</w:t>
             </w:r>
           </w:p>
         </w:tc>
@@ -4080,199 +4080,199 @@
                 <w:rFonts w:ascii="Calibri" w:hAnsi="Calibri"/>
                 <w:sz w:val="20"/>
               </w:rPr>
-              <w:t xml:space="default">Food Security Status</w:t>
-            </w:r>
-          </w:p>
-        </w:tc>
-        <w:tc>
-          <w:tcPr>
-            <w:tcBorders>
-              <w:top w:val="single" w:space="0" w:color="D3D3D3"/>
-              <w:bottom w:val="single" w:space="0" w:color="D3D3D3"/>
-              <w:start w:val="single" w:space="0" w:color="D3D3D3"/>
-              <w:end w:val="single" w:space="0" w:color="D3D3D3"/>
-            </w:tcBorders>
-          </w:tcPr>
-          <w:p>
-            <w:pPr>
-              <w:spacing w:before="0" w:after="60"/>
-              <w:keepNext/>
-              <w:jc w:val="center"/>
-            </w:pPr>
-            <w:r>
-              <w:rPr>
-                <w:rFonts w:ascii="Calibri" w:hAnsi="Calibri"/>
-                <w:sz w:val="20"/>
-              </w:rPr>
-              <w:t xml:space="default"/>
-            </w:r>
-          </w:p>
-        </w:tc>
-        <w:tc>
-          <w:tcPr>
-            <w:tcBorders>
-              <w:top w:val="single" w:space="0" w:color="D3D3D3"/>
-              <w:bottom w:val="single" w:space="0" w:color="D3D3D3"/>
-              <w:start w:val="single" w:space="0" w:color="D3D3D3"/>
-              <w:end w:val="single" w:space="0" w:color="D3D3D3"/>
-            </w:tcBorders>
-          </w:tcPr>
-          <w:p>
-            <w:pPr>
-              <w:spacing w:before="0" w:after="60"/>
-              <w:keepNext/>
-              <w:jc w:val="center"/>
-            </w:pPr>
-            <w:r>
-              <w:rPr>
-                <w:rFonts w:ascii="Calibri" w:hAnsi="Calibri"/>
-                <w:sz w:val="20"/>
-              </w:rPr>
-              <w:t xml:space="default"/>
-            </w:r>
-          </w:p>
-        </w:tc>
-        <w:tc>
-          <w:tcPr>
-            <w:tcBorders>
-              <w:top w:val="single" w:space="0" w:color="D3D3D3"/>
-              <w:bottom w:val="single" w:space="0" w:color="D3D3D3"/>
-              <w:start w:val="single" w:space="0" w:color="D3D3D3"/>
-              <w:end w:val="single" w:space="0" w:color="D3D3D3"/>
-            </w:tcBorders>
-          </w:tcPr>
-          <w:p>
-            <w:pPr>
-              <w:spacing w:before="0" w:after="60"/>
-              <w:keepNext/>
-              <w:jc w:val="center"/>
-            </w:pPr>
-            <w:r>
-              <w:rPr>
-                <w:rFonts w:ascii="Calibri" w:hAnsi="Calibri"/>
-                <w:sz w:val="20"/>
-              </w:rPr>
-              <w:t xml:space="default"/>
-            </w:r>
-          </w:p>
-        </w:tc>
-        <w:tc>
-          <w:tcPr>
-            <w:tcBorders>
-              <w:top w:val="single" w:space="0" w:color="D3D3D3"/>
-              <w:bottom w:val="single" w:space="0" w:color="D3D3D3"/>
-              <w:start w:val="single" w:space="0" w:color="D3D3D3"/>
-              <w:end w:val="single" w:space="0" w:color="D3D3D3"/>
-            </w:tcBorders>
-          </w:tcPr>
-          <w:p>
-            <w:pPr>
-              <w:spacing w:before="0" w:after="60"/>
-              <w:keepNext/>
-              <w:jc w:val="center"/>
-            </w:pPr>
-            <w:r>
-              <w:rPr>
-                <w:rFonts w:ascii="Calibri" w:hAnsi="Calibri"/>
-                <w:sz w:val="20"/>
-              </w:rPr>
-              <w:t xml:space="default"/>
-            </w:r>
-          </w:p>
-        </w:tc>
-        <w:tc>
-          <w:tcPr>
-            <w:tcBorders>
-              <w:top w:val="single" w:space="0" w:color="D3D3D3"/>
-              <w:bottom w:val="single" w:space="0" w:color="D3D3D3"/>
-              <w:start w:val="single" w:space="0" w:color="D3D3D3"/>
-              <w:end w:val="single" w:space="0" w:color="D3D3D3"/>
-            </w:tcBorders>
-          </w:tcPr>
-          <w:p>
-            <w:pPr>
-              <w:spacing w:before="0" w:after="60"/>
-              <w:keepNext/>
-              <w:jc w:val="center"/>
-            </w:pPr>
-            <w:r>
-              <w:rPr>
-                <w:rFonts w:ascii="Calibri" w:hAnsi="Calibri"/>
-                <w:sz w:val="20"/>
-              </w:rPr>
-              <w:t xml:space="default"/>
-            </w:r>
-          </w:p>
-        </w:tc>
-        <w:tc>
-          <w:tcPr>
-            <w:tcBorders>
-              <w:top w:val="single" w:space="0" w:color="D3D3D3"/>
-              <w:bottom w:val="single" w:space="0" w:color="D3D3D3"/>
-              <w:start w:val="single" w:space="0" w:color="D3D3D3"/>
-              <w:end w:val="single" w:space="0" w:color="D3D3D3"/>
-            </w:tcBorders>
-          </w:tcPr>
-          <w:p>
-            <w:pPr>
-              <w:spacing w:before="0" w:after="60"/>
-              <w:keepNext/>
-              <w:jc w:val="center"/>
-            </w:pPr>
-            <w:r>
-              <w:rPr>
-                <w:rFonts w:ascii="Calibri" w:hAnsi="Calibri"/>
-                <w:sz w:val="20"/>
-              </w:rPr>
-              <w:t xml:space="default"/>
-            </w:r>
-          </w:p>
-        </w:tc>
-        <w:tc>
-          <w:tcPr>
-            <w:tcBorders>
-              <w:top w:val="single" w:space="0" w:color="D3D3D3"/>
-              <w:bottom w:val="single" w:space="0" w:color="D3D3D3"/>
-              <w:start w:val="single" w:space="0" w:color="D3D3D3"/>
-              <w:end w:val="single" w:space="0" w:color="D3D3D3"/>
-            </w:tcBorders>
-          </w:tcPr>
-          <w:p>
-            <w:pPr>
-              <w:spacing w:before="0" w:after="60"/>
-              <w:keepNext/>
-              <w:jc w:val="center"/>
-            </w:pPr>
-            <w:r>
-              <w:rPr>
-                <w:rFonts w:ascii="Calibri" w:hAnsi="Calibri"/>
-                <w:sz w:val="20"/>
-              </w:rPr>
-              <w:t xml:space="default"/>
-            </w:r>
-          </w:p>
-        </w:tc>
-        <w:tc>
-          <w:tcPr>
-            <w:tcBorders>
-              <w:top w:val="single" w:space="0" w:color="D3D3D3"/>
-              <w:bottom w:val="single" w:space="0" w:color="D3D3D3"/>
-              <w:start w:val="single" w:space="0" w:color="D3D3D3"/>
-              <w:end w:val="single" w:space="0" w:color="D3D3D3"/>
-            </w:tcBorders>
-          </w:tcPr>
-          <w:p>
-            <w:pPr>
-              <w:spacing w:before="0" w:after="60"/>
-              <w:keepNext/>
-              <w:jc w:val="center"/>
-            </w:pPr>
-            <w:r>
-              <w:rPr>
-                <w:rFonts w:ascii="Calibri" w:hAnsi="Calibri"/>
-                <w:sz w:val="20"/>
-              </w:rPr>
-              <w:t xml:space="default"/>
+              <w:t xml:space="default">    High School / Some College</w:t>
+            </w:r>
+          </w:p>
+        </w:tc>
+        <w:tc>
+          <w:tcPr>
+            <w:tcBorders>
+              <w:top w:val="single" w:space="0" w:color="D3D3D3"/>
+              <w:bottom w:val="single" w:space="0" w:color="D3D3D3"/>
+              <w:start w:val="single" w:space="0" w:color="D3D3D3"/>
+              <w:end w:val="single" w:space="0" w:color="D3D3D3"/>
+            </w:tcBorders>
+          </w:tcPr>
+          <w:p>
+            <w:pPr>
+              <w:spacing w:before="0" w:after="60"/>
+              <w:keepNext/>
+              <w:jc w:val="center"/>
+            </w:pPr>
+            <w:r>
+              <w:rPr>
+                <w:rFonts w:ascii="Calibri" w:hAnsi="Calibri"/>
+                <w:sz w:val="20"/>
+              </w:rPr>
+              <w:t xml:space="default">261 (55%)</w:t>
+            </w:r>
+          </w:p>
+        </w:tc>
+        <w:tc>
+          <w:tcPr>
+            <w:tcBorders>
+              <w:top w:val="single" w:space="0" w:color="D3D3D3"/>
+              <w:bottom w:val="single" w:space="0" w:color="D3D3D3"/>
+              <w:start w:val="single" w:space="0" w:color="D3D3D3"/>
+              <w:end w:val="single" w:space="0" w:color="D3D3D3"/>
+            </w:tcBorders>
+          </w:tcPr>
+          <w:p>
+            <w:pPr>
+              <w:spacing w:before="0" w:after="60"/>
+              <w:keepNext/>
+              <w:jc w:val="center"/>
+            </w:pPr>
+            <w:r>
+              <w:rPr>
+                <w:rFonts w:ascii="Calibri" w:hAnsi="Calibri"/>
+                <w:sz w:val="20"/>
+              </w:rPr>
+              <w:t xml:space="default">342 (59%)</w:t>
+            </w:r>
+          </w:p>
+        </w:tc>
+        <w:tc>
+          <w:tcPr>
+            <w:tcBorders>
+              <w:top w:val="single" w:space="0" w:color="D3D3D3"/>
+              <w:bottom w:val="single" w:space="0" w:color="D3D3D3"/>
+              <w:start w:val="single" w:space="0" w:color="D3D3D3"/>
+              <w:end w:val="single" w:space="0" w:color="D3D3D3"/>
+            </w:tcBorders>
+          </w:tcPr>
+          <w:p>
+            <w:pPr>
+              <w:spacing w:before="0" w:after="60"/>
+              <w:keepNext/>
+              <w:jc w:val="center"/>
+            </w:pPr>
+            <w:r>
+              <w:rPr>
+                <w:rFonts w:ascii="Calibri" w:hAnsi="Calibri"/>
+                <w:sz w:val="20"/>
+              </w:rPr>
+              <w:t xml:space="default">359 (59%)</w:t>
+            </w:r>
+          </w:p>
+        </w:tc>
+        <w:tc>
+          <w:tcPr>
+            <w:tcBorders>
+              <w:top w:val="single" w:space="0" w:color="D3D3D3"/>
+              <w:bottom w:val="single" w:space="0" w:color="D3D3D3"/>
+              <w:start w:val="single" w:space="0" w:color="D3D3D3"/>
+              <w:end w:val="single" w:space="0" w:color="D3D3D3"/>
+            </w:tcBorders>
+          </w:tcPr>
+          <w:p>
+            <w:pPr>
+              <w:spacing w:before="0" w:after="60"/>
+              <w:keepNext/>
+              <w:jc w:val="center"/>
+            </w:pPr>
+            <w:r>
+              <w:rPr>
+                <w:rFonts w:ascii="Calibri" w:hAnsi="Calibri"/>
+                <w:sz w:val="20"/>
+              </w:rPr>
+              <w:t xml:space="default">220 (55%)</w:t>
+            </w:r>
+          </w:p>
+        </w:tc>
+        <w:tc>
+          <w:tcPr>
+            <w:tcBorders>
+              <w:top w:val="single" w:space="0" w:color="D3D3D3"/>
+              <w:bottom w:val="single" w:space="0" w:color="D3D3D3"/>
+              <w:start w:val="single" w:space="0" w:color="D3D3D3"/>
+              <w:end w:val="single" w:space="0" w:color="D3D3D3"/>
+            </w:tcBorders>
+          </w:tcPr>
+          <w:p>
+            <w:pPr>
+              <w:spacing w:before="0" w:after="60"/>
+              <w:keepNext/>
+              <w:jc w:val="center"/>
+            </w:pPr>
+            <w:r>
+              <w:rPr>
+                <w:rFonts w:ascii="Calibri" w:hAnsi="Calibri"/>
+                <w:sz w:val="20"/>
+              </w:rPr>
+              <w:t xml:space="default">230 (42%)</w:t>
+            </w:r>
+          </w:p>
+        </w:tc>
+        <w:tc>
+          <w:tcPr>
+            <w:tcBorders>
+              <w:top w:val="single" w:space="0" w:color="D3D3D3"/>
+              <w:bottom w:val="single" w:space="0" w:color="D3D3D3"/>
+              <w:start w:val="single" w:space="0" w:color="D3D3D3"/>
+              <w:end w:val="single" w:space="0" w:color="D3D3D3"/>
+            </w:tcBorders>
+          </w:tcPr>
+          <w:p>
+            <w:pPr>
+              <w:spacing w:before="0" w:after="60"/>
+              <w:keepNext/>
+              <w:jc w:val="center"/>
+            </w:pPr>
+            <w:r>
+              <w:rPr>
+                <w:rFonts w:ascii="Calibri" w:hAnsi="Calibri"/>
+                <w:sz w:val="20"/>
+              </w:rPr>
+              <w:t xml:space="default">256 (56%)</w:t>
+            </w:r>
+          </w:p>
+        </w:tc>
+        <w:tc>
+          <w:tcPr>
+            <w:tcBorders>
+              <w:top w:val="single" w:space="0" w:color="D3D3D3"/>
+              <w:bottom w:val="single" w:space="0" w:color="D3D3D3"/>
+              <w:start w:val="single" w:space="0" w:color="D3D3D3"/>
+              <w:end w:val="single" w:space="0" w:color="D3D3D3"/>
+            </w:tcBorders>
+          </w:tcPr>
+          <w:p>
+            <w:pPr>
+              <w:spacing w:before="0" w:after="60"/>
+              <w:keepNext/>
+              <w:jc w:val="center"/>
+            </w:pPr>
+            <w:r>
+              <w:rPr>
+                <w:rFonts w:ascii="Calibri" w:hAnsi="Calibri"/>
+                <w:sz w:val="20"/>
+              </w:rPr>
+              <w:t xml:space="default">312 (54%)</w:t>
+            </w:r>
+          </w:p>
+        </w:tc>
+        <w:tc>
+          <w:tcPr>
+            <w:tcBorders>
+              <w:top w:val="single" w:space="0" w:color="D3D3D3"/>
+              <w:bottom w:val="single" w:space="0" w:color="D3D3D3"/>
+              <w:start w:val="single" w:space="0" w:color="D3D3D3"/>
+              <w:end w:val="single" w:space="0" w:color="D3D3D3"/>
+            </w:tcBorders>
+          </w:tcPr>
+          <w:p>
+            <w:pPr>
+              <w:spacing w:before="0" w:after="60"/>
+              <w:keepNext/>
+              <w:jc w:val="center"/>
+            </w:pPr>
+            <w:r>
+              <w:rPr>
+                <w:rFonts w:ascii="Calibri" w:hAnsi="Calibri"/>
+                <w:sz w:val="20"/>
+              </w:rPr>
+              <w:t xml:space="default">213 (51%)</w:t>
             </w:r>
           </w:p>
         </w:tc>
@@ -4301,199 +4301,199 @@
                 <w:rFonts w:ascii="Calibri" w:hAnsi="Calibri"/>
                 <w:sz w:val="20"/>
               </w:rPr>
-              <w:t xml:space="default">    High/Marginal Food Security</w:t>
-            </w:r>
-          </w:p>
-        </w:tc>
-        <w:tc>
-          <w:tcPr>
-            <w:tcBorders>
-              <w:top w:val="single" w:space="0" w:color="D3D3D3"/>
-              <w:bottom w:val="single" w:space="0" w:color="D3D3D3"/>
-              <w:start w:val="single" w:space="0" w:color="D3D3D3"/>
-              <w:end w:val="single" w:space="0" w:color="D3D3D3"/>
-            </w:tcBorders>
-          </w:tcPr>
-          <w:p>
-            <w:pPr>
-              <w:spacing w:before="0" w:after="60"/>
-              <w:keepNext/>
-              <w:jc w:val="center"/>
-            </w:pPr>
-            <w:r>
-              <w:rPr>
-                <w:rFonts w:ascii="Calibri" w:hAnsi="Calibri"/>
-                <w:sz w:val="20"/>
-              </w:rPr>
-              <w:t xml:space="default">383 (87%)</w:t>
-            </w:r>
-          </w:p>
-        </w:tc>
-        <w:tc>
-          <w:tcPr>
-            <w:tcBorders>
-              <w:top w:val="single" w:space="0" w:color="D3D3D3"/>
-              <w:bottom w:val="single" w:space="0" w:color="D3D3D3"/>
-              <w:start w:val="single" w:space="0" w:color="D3D3D3"/>
-              <w:end w:val="single" w:space="0" w:color="D3D3D3"/>
-            </w:tcBorders>
-          </w:tcPr>
-          <w:p>
-            <w:pPr>
-              <w:spacing w:before="0" w:after="60"/>
-              <w:keepNext/>
-              <w:jc w:val="center"/>
-            </w:pPr>
-            <w:r>
-              <w:rPr>
-                <w:rFonts w:ascii="Calibri" w:hAnsi="Calibri"/>
-                <w:sz w:val="20"/>
-              </w:rPr>
-              <w:t xml:space="default">427 (83%)</w:t>
-            </w:r>
-          </w:p>
-        </w:tc>
-        <w:tc>
-          <w:tcPr>
-            <w:tcBorders>
-              <w:top w:val="single" w:space="0" w:color="D3D3D3"/>
-              <w:bottom w:val="single" w:space="0" w:color="D3D3D3"/>
-              <w:start w:val="single" w:space="0" w:color="D3D3D3"/>
-              <w:end w:val="single" w:space="0" w:color="D3D3D3"/>
-            </w:tcBorders>
-          </w:tcPr>
-          <w:p>
-            <w:pPr>
-              <w:spacing w:before="0" w:after="60"/>
-              <w:keepNext/>
-              <w:jc w:val="center"/>
-            </w:pPr>
-            <w:r>
-              <w:rPr>
-                <w:rFonts w:ascii="Calibri" w:hAnsi="Calibri"/>
-                <w:sz w:val="20"/>
-              </w:rPr>
-              <w:t xml:space="default">493 (83%)</w:t>
-            </w:r>
-          </w:p>
-        </w:tc>
-        <w:tc>
-          <w:tcPr>
-            <w:tcBorders>
-              <w:top w:val="single" w:space="0" w:color="D3D3D3"/>
-              <w:bottom w:val="single" w:space="0" w:color="D3D3D3"/>
-              <w:start w:val="single" w:space="0" w:color="D3D3D3"/>
-              <w:end w:val="single" w:space="0" w:color="D3D3D3"/>
-            </w:tcBorders>
-          </w:tcPr>
-          <w:p>
-            <w:pPr>
-              <w:spacing w:before="0" w:after="60"/>
-              <w:keepNext/>
-              <w:jc w:val="center"/>
-            </w:pPr>
-            <w:r>
-              <w:rPr>
-                <w:rFonts w:ascii="Calibri" w:hAnsi="Calibri"/>
-                <w:sz w:val="20"/>
-              </w:rPr>
-              <w:t xml:space="default">299 (77%)</w:t>
-            </w:r>
-          </w:p>
-        </w:tc>
-        <w:tc>
-          <w:tcPr>
-            <w:tcBorders>
-              <w:top w:val="single" w:space="0" w:color="D3D3D3"/>
-              <w:bottom w:val="single" w:space="0" w:color="D3D3D3"/>
-              <w:start w:val="single" w:space="0" w:color="D3D3D3"/>
-              <w:end w:val="single" w:space="0" w:color="D3D3D3"/>
-            </w:tcBorders>
-          </w:tcPr>
-          <w:p>
-            <w:pPr>
-              <w:spacing w:before="0" w:after="60"/>
-              <w:keepNext/>
-              <w:jc w:val="center"/>
-            </w:pPr>
-            <w:r>
-              <w:rPr>
-                <w:rFonts w:ascii="Calibri" w:hAnsi="Calibri"/>
-                <w:sz w:val="20"/>
-              </w:rPr>
-              <w:t xml:space="default">391 (83%)</w:t>
-            </w:r>
-          </w:p>
-        </w:tc>
-        <w:tc>
-          <w:tcPr>
-            <w:tcBorders>
-              <w:top w:val="single" w:space="0" w:color="D3D3D3"/>
-              <w:bottom w:val="single" w:space="0" w:color="D3D3D3"/>
-              <w:start w:val="single" w:space="0" w:color="D3D3D3"/>
-              <w:end w:val="single" w:space="0" w:color="D3D3D3"/>
-            </w:tcBorders>
-          </w:tcPr>
-          <w:p>
-            <w:pPr>
-              <w:spacing w:before="0" w:after="60"/>
-              <w:keepNext/>
-              <w:jc w:val="center"/>
-            </w:pPr>
-            <w:r>
-              <w:rPr>
-                <w:rFonts w:ascii="Calibri" w:hAnsi="Calibri"/>
-                <w:sz w:val="20"/>
-              </w:rPr>
-              <w:t xml:space="default">359 (83%)</w:t>
-            </w:r>
-          </w:p>
-        </w:tc>
-        <w:tc>
-          <w:tcPr>
-            <w:tcBorders>
-              <w:top w:val="single" w:space="0" w:color="D3D3D3"/>
-              <w:bottom w:val="single" w:space="0" w:color="D3D3D3"/>
-              <w:start w:val="single" w:space="0" w:color="D3D3D3"/>
-              <w:end w:val="single" w:space="0" w:color="D3D3D3"/>
-            </w:tcBorders>
-          </w:tcPr>
-          <w:p>
-            <w:pPr>
-              <w:spacing w:before="0" w:after="60"/>
-              <w:keepNext/>
-              <w:jc w:val="center"/>
-            </w:pPr>
-            <w:r>
-              <w:rPr>
-                <w:rFonts w:ascii="Calibri" w:hAnsi="Calibri"/>
-                <w:sz w:val="20"/>
-              </w:rPr>
-              <w:t xml:space="default">439 (81%)</w:t>
-            </w:r>
-          </w:p>
-        </w:tc>
-        <w:tc>
-          <w:tcPr>
-            <w:tcBorders>
-              <w:top w:val="single" w:space="0" w:color="D3D3D3"/>
-              <w:bottom w:val="single" w:space="0" w:color="D3D3D3"/>
-              <w:start w:val="single" w:space="0" w:color="D3D3D3"/>
-              <w:end w:val="single" w:space="0" w:color="D3D3D3"/>
-            </w:tcBorders>
-          </w:tcPr>
-          <w:p>
-            <w:pPr>
-              <w:spacing w:before="0" w:after="60"/>
-              <w:keepNext/>
-              <w:jc w:val="center"/>
-            </w:pPr>
-            <w:r>
-              <w:rPr>
-                <w:rFonts w:ascii="Calibri" w:hAnsi="Calibri"/>
-                <w:sz w:val="20"/>
-              </w:rPr>
-              <w:t xml:space="default">296 (76%)</w:t>
+              <w:t xml:space="default">    College Grad or Above</w:t>
+            </w:r>
+          </w:p>
+        </w:tc>
+        <w:tc>
+          <w:tcPr>
+            <w:tcBorders>
+              <w:top w:val="single" w:space="0" w:color="D3D3D3"/>
+              <w:bottom w:val="single" w:space="0" w:color="D3D3D3"/>
+              <w:start w:val="single" w:space="0" w:color="D3D3D3"/>
+              <w:end w:val="single" w:space="0" w:color="D3D3D3"/>
+            </w:tcBorders>
+          </w:tcPr>
+          <w:p>
+            <w:pPr>
+              <w:spacing w:before="0" w:after="60"/>
+              <w:keepNext/>
+              <w:jc w:val="center"/>
+            </w:pPr>
+            <w:r>
+              <w:rPr>
+                <w:rFonts w:ascii="Calibri" w:hAnsi="Calibri"/>
+                <w:sz w:val="20"/>
+              </w:rPr>
+              <w:t xml:space="default">126 (33%)</w:t>
+            </w:r>
+          </w:p>
+        </w:tc>
+        <w:tc>
+          <w:tcPr>
+            <w:tcBorders>
+              <w:top w:val="single" w:space="0" w:color="D3D3D3"/>
+              <w:bottom w:val="single" w:space="0" w:color="D3D3D3"/>
+              <w:start w:val="single" w:space="0" w:color="D3D3D3"/>
+              <w:end w:val="single" w:space="0" w:color="D3D3D3"/>
+            </w:tcBorders>
+          </w:tcPr>
+          <w:p>
+            <w:pPr>
+              <w:spacing w:before="0" w:after="60"/>
+              <w:keepNext/>
+              <w:jc w:val="center"/>
+            </w:pPr>
+            <w:r>
+              <w:rPr>
+                <w:rFonts w:ascii="Calibri" w:hAnsi="Calibri"/>
+                <w:sz w:val="20"/>
+              </w:rPr>
+              <w:t xml:space="default">118 (30%)</w:t>
+            </w:r>
+          </w:p>
+        </w:tc>
+        <w:tc>
+          <w:tcPr>
+            <w:tcBorders>
+              <w:top w:val="single" w:space="0" w:color="D3D3D3"/>
+              <w:bottom w:val="single" w:space="0" w:color="D3D3D3"/>
+              <w:start w:val="single" w:space="0" w:color="D3D3D3"/>
+              <w:end w:val="single" w:space="0" w:color="D3D3D3"/>
+            </w:tcBorders>
+          </w:tcPr>
+          <w:p>
+            <w:pPr>
+              <w:spacing w:before="0" w:after="60"/>
+              <w:keepNext/>
+              <w:jc w:val="center"/>
+            </w:pPr>
+            <w:r>
+              <w:rPr>
+                <w:rFonts w:ascii="Calibri" w:hAnsi="Calibri"/>
+                <w:sz w:val="20"/>
+              </w:rPr>
+              <w:t xml:space="default">134 (25%)</w:t>
+            </w:r>
+          </w:p>
+        </w:tc>
+        <w:tc>
+          <w:tcPr>
+            <w:tcBorders>
+              <w:top w:val="single" w:space="0" w:color="D3D3D3"/>
+              <w:bottom w:val="single" w:space="0" w:color="D3D3D3"/>
+              <w:start w:val="single" w:space="0" w:color="D3D3D3"/>
+              <w:end w:val="single" w:space="0" w:color="D3D3D3"/>
+            </w:tcBorders>
+          </w:tcPr>
+          <w:p>
+            <w:pPr>
+              <w:spacing w:before="0" w:after="60"/>
+              <w:keepNext/>
+              <w:jc w:val="center"/>
+            </w:pPr>
+            <w:r>
+              <w:rPr>
+                <w:rFonts w:ascii="Calibri" w:hAnsi="Calibri"/>
+                <w:sz w:val="20"/>
+              </w:rPr>
+              <w:t xml:space="default">62 (20%)</w:t>
+            </w:r>
+          </w:p>
+        </w:tc>
+        <w:tc>
+          <w:tcPr>
+            <w:tcBorders>
+              <w:top w:val="single" w:space="0" w:color="D3D3D3"/>
+              <w:bottom w:val="single" w:space="0" w:color="D3D3D3"/>
+              <w:start w:val="single" w:space="0" w:color="D3D3D3"/>
+              <w:end w:val="single" w:space="0" w:color="D3D3D3"/>
+            </w:tcBorders>
+          </w:tcPr>
+          <w:p>
+            <w:pPr>
+              <w:spacing w:before="0" w:after="60"/>
+              <w:keepNext/>
+              <w:jc w:val="center"/>
+            </w:pPr>
+            <w:r>
+              <w:rPr>
+                <w:rFonts w:ascii="Calibri" w:hAnsi="Calibri"/>
+                <w:sz w:val="20"/>
+              </w:rPr>
+              <w:t xml:space="default">175 (43%)</w:t>
+            </w:r>
+          </w:p>
+        </w:tc>
+        <w:tc>
+          <w:tcPr>
+            <w:tcBorders>
+              <w:top w:val="single" w:space="0" w:color="D3D3D3"/>
+              <w:bottom w:val="single" w:space="0" w:color="D3D3D3"/>
+              <w:start w:val="single" w:space="0" w:color="D3D3D3"/>
+              <w:end w:val="single" w:space="0" w:color="D3D3D3"/>
+            </w:tcBorders>
+          </w:tcPr>
+          <w:p>
+            <w:pPr>
+              <w:spacing w:before="0" w:after="60"/>
+              <w:keepNext/>
+              <w:jc w:val="center"/>
+            </w:pPr>
+            <w:r>
+              <w:rPr>
+                <w:rFonts w:ascii="Calibri" w:hAnsi="Calibri"/>
+                <w:sz w:val="20"/>
+              </w:rPr>
+              <w:t xml:space="default">98 (28%)</w:t>
+            </w:r>
+          </w:p>
+        </w:tc>
+        <w:tc>
+          <w:tcPr>
+            <w:tcBorders>
+              <w:top w:val="single" w:space="0" w:color="D3D3D3"/>
+              <w:bottom w:val="single" w:space="0" w:color="D3D3D3"/>
+              <w:start w:val="single" w:space="0" w:color="D3D3D3"/>
+              <w:end w:val="single" w:space="0" w:color="D3D3D3"/>
+            </w:tcBorders>
+          </w:tcPr>
+          <w:p>
+            <w:pPr>
+              <w:spacing w:before="0" w:after="60"/>
+              <w:keepNext/>
+              <w:jc w:val="center"/>
+            </w:pPr>
+            <w:r>
+              <w:rPr>
+                <w:rFonts w:ascii="Calibri" w:hAnsi="Calibri"/>
+                <w:sz w:val="20"/>
+              </w:rPr>
+              <w:t xml:space="default">125 (29%)</w:t>
+            </w:r>
+          </w:p>
+        </w:tc>
+        <w:tc>
+          <w:tcPr>
+            <w:tcBorders>
+              <w:top w:val="single" w:space="0" w:color="D3D3D3"/>
+              <w:bottom w:val="single" w:space="0" w:color="D3D3D3"/>
+              <w:start w:val="single" w:space="0" w:color="D3D3D3"/>
+              <w:end w:val="single" w:space="0" w:color="D3D3D3"/>
+            </w:tcBorders>
+          </w:tcPr>
+          <w:p>
+            <w:pPr>
+              <w:spacing w:before="0" w:after="60"/>
+              <w:keepNext/>
+              <w:jc w:val="center"/>
+            </w:pPr>
+            <w:r>
+              <w:rPr>
+                <w:rFonts w:ascii="Calibri" w:hAnsi="Calibri"/>
+                <w:sz w:val="20"/>
+              </w:rPr>
+              <w:t xml:space="default">70 (23%)</w:t>
             </w:r>
           </w:p>
         </w:tc>
@@ -4522,199 +4522,199 @@
                 <w:rFonts w:ascii="Calibri" w:hAnsi="Calibri"/>
                 <w:sz w:val="20"/>
               </w:rPr>
-              <w:t xml:space="default">    Marginal Food Security</w:t>
-            </w:r>
-          </w:p>
-        </w:tc>
-        <w:tc>
-          <w:tcPr>
-            <w:tcBorders>
-              <w:top w:val="single" w:space="0" w:color="D3D3D3"/>
-              <w:bottom w:val="single" w:space="0" w:color="D3D3D3"/>
-              <w:start w:val="single" w:space="0" w:color="D3D3D3"/>
-              <w:end w:val="single" w:space="0" w:color="D3D3D3"/>
-            </w:tcBorders>
-          </w:tcPr>
-          <w:p>
-            <w:pPr>
-              <w:spacing w:before="0" w:after="60"/>
-              <w:keepNext/>
-              <w:jc w:val="center"/>
-            </w:pPr>
-            <w:r>
-              <w:rPr>
-                <w:rFonts w:ascii="Calibri" w:hAnsi="Calibri"/>
-                <w:sz w:val="20"/>
-              </w:rPr>
-              <w:t xml:space="default">30 (3.8%)</w:t>
-            </w:r>
-          </w:p>
-        </w:tc>
-        <w:tc>
-          <w:tcPr>
-            <w:tcBorders>
-              <w:top w:val="single" w:space="0" w:color="D3D3D3"/>
-              <w:bottom w:val="single" w:space="0" w:color="D3D3D3"/>
-              <w:start w:val="single" w:space="0" w:color="D3D3D3"/>
-              <w:end w:val="single" w:space="0" w:color="D3D3D3"/>
-            </w:tcBorders>
-          </w:tcPr>
-          <w:p>
-            <w:pPr>
-              <w:spacing w:before="0" w:after="60"/>
-              <w:keepNext/>
-              <w:jc w:val="center"/>
-            </w:pPr>
-            <w:r>
-              <w:rPr>
-                <w:rFonts w:ascii="Calibri" w:hAnsi="Calibri"/>
-                <w:sz w:val="20"/>
-              </w:rPr>
-              <w:t xml:space="default">40 (5.6%)</w:t>
-            </w:r>
-          </w:p>
-        </w:tc>
-        <w:tc>
-          <w:tcPr>
-            <w:tcBorders>
-              <w:top w:val="single" w:space="0" w:color="D3D3D3"/>
-              <w:bottom w:val="single" w:space="0" w:color="D3D3D3"/>
-              <w:start w:val="single" w:space="0" w:color="D3D3D3"/>
-              <w:end w:val="single" w:space="0" w:color="D3D3D3"/>
-            </w:tcBorders>
-          </w:tcPr>
-          <w:p>
-            <w:pPr>
-              <w:spacing w:before="0" w:after="60"/>
-              <w:keepNext/>
-              <w:jc w:val="center"/>
-            </w:pPr>
-            <w:r>
-              <w:rPr>
-                <w:rFonts w:ascii="Calibri" w:hAnsi="Calibri"/>
-                <w:sz w:val="20"/>
-              </w:rPr>
-              <w:t xml:space="default">48 (6.5%)</w:t>
-            </w:r>
-          </w:p>
-        </w:tc>
-        <w:tc>
-          <w:tcPr>
-            <w:tcBorders>
-              <w:top w:val="single" w:space="0" w:color="D3D3D3"/>
-              <w:bottom w:val="single" w:space="0" w:color="D3D3D3"/>
-              <w:start w:val="single" w:space="0" w:color="D3D3D3"/>
-              <w:end w:val="single" w:space="0" w:color="D3D3D3"/>
-            </w:tcBorders>
-          </w:tcPr>
-          <w:p>
-            <w:pPr>
-              <w:spacing w:before="0" w:after="60"/>
-              <w:keepNext/>
-              <w:jc w:val="center"/>
-            </w:pPr>
-            <w:r>
-              <w:rPr>
-                <w:rFonts w:ascii="Calibri" w:hAnsi="Calibri"/>
-                <w:sz w:val="20"/>
-              </w:rPr>
-              <w:t xml:space="default">37 (8.8%)</w:t>
-            </w:r>
-          </w:p>
-        </w:tc>
-        <w:tc>
-          <w:tcPr>
-            <w:tcBorders>
-              <w:top w:val="single" w:space="0" w:color="D3D3D3"/>
-              <w:bottom w:val="single" w:space="0" w:color="D3D3D3"/>
-              <w:start w:val="single" w:space="0" w:color="D3D3D3"/>
-              <w:end w:val="single" w:space="0" w:color="D3D3D3"/>
-            </w:tcBorders>
-          </w:tcPr>
-          <w:p>
-            <w:pPr>
-              <w:spacing w:before="0" w:after="60"/>
-              <w:keepNext/>
-              <w:jc w:val="center"/>
-            </w:pPr>
-            <w:r>
-              <w:rPr>
-                <w:rFonts w:ascii="Calibri" w:hAnsi="Calibri"/>
-                <w:sz w:val="20"/>
-              </w:rPr>
-              <w:t xml:space="default">43 (5.5%)</w:t>
-            </w:r>
-          </w:p>
-        </w:tc>
-        <w:tc>
-          <w:tcPr>
-            <w:tcBorders>
-              <w:top w:val="single" w:space="0" w:color="D3D3D3"/>
-              <w:bottom w:val="single" w:space="0" w:color="D3D3D3"/>
-              <w:start w:val="single" w:space="0" w:color="D3D3D3"/>
-              <w:end w:val="single" w:space="0" w:color="D3D3D3"/>
-            </w:tcBorders>
-          </w:tcPr>
-          <w:p>
-            <w:pPr>
-              <w:spacing w:before="0" w:after="60"/>
-              <w:keepNext/>
-              <w:jc w:val="center"/>
-            </w:pPr>
-            <w:r>
-              <w:rPr>
-                <w:rFonts w:ascii="Calibri" w:hAnsi="Calibri"/>
-                <w:sz w:val="20"/>
-              </w:rPr>
-              <w:t xml:space="default">38 (6.7%)</w:t>
-            </w:r>
-          </w:p>
-        </w:tc>
-        <w:tc>
-          <w:tcPr>
-            <w:tcBorders>
-              <w:top w:val="single" w:space="0" w:color="D3D3D3"/>
-              <w:bottom w:val="single" w:space="0" w:color="D3D3D3"/>
-              <w:start w:val="single" w:space="0" w:color="D3D3D3"/>
-              <w:end w:val="single" w:space="0" w:color="D3D3D3"/>
-            </w:tcBorders>
-          </w:tcPr>
-          <w:p>
-            <w:pPr>
-              <w:spacing w:before="0" w:after="60"/>
-              <w:keepNext/>
-              <w:jc w:val="center"/>
-            </w:pPr>
-            <w:r>
-              <w:rPr>
-                <w:rFonts w:ascii="Calibri" w:hAnsi="Calibri"/>
-                <w:sz w:val="20"/>
-              </w:rPr>
-              <w:t xml:space="default">52 (7.3%)</w:t>
-            </w:r>
-          </w:p>
-        </w:tc>
-        <w:tc>
-          <w:tcPr>
-            <w:tcBorders>
-              <w:top w:val="single" w:space="0" w:color="D3D3D3"/>
-              <w:bottom w:val="single" w:space="0" w:color="D3D3D3"/>
-              <w:start w:val="single" w:space="0" w:color="D3D3D3"/>
-              <w:end w:val="single" w:space="0" w:color="D3D3D3"/>
-            </w:tcBorders>
-          </w:tcPr>
-          <w:p>
-            <w:pPr>
-              <w:spacing w:before="0" w:after="60"/>
-              <w:keepNext/>
-              <w:jc w:val="center"/>
-            </w:pPr>
-            <w:r>
-              <w:rPr>
-                <w:rFonts w:ascii="Calibri" w:hAnsi="Calibri"/>
-                <w:sz w:val="20"/>
-              </w:rPr>
-              <w:t xml:space="default">42 (7.7%)</w:t>
+              <w:t xml:space="default">Food Security Status</w:t>
+            </w:r>
+          </w:p>
+        </w:tc>
+        <w:tc>
+          <w:tcPr>
+            <w:tcBorders>
+              <w:top w:val="single" w:space="0" w:color="D3D3D3"/>
+              <w:bottom w:val="single" w:space="0" w:color="D3D3D3"/>
+              <w:start w:val="single" w:space="0" w:color="D3D3D3"/>
+              <w:end w:val="single" w:space="0" w:color="D3D3D3"/>
+            </w:tcBorders>
+          </w:tcPr>
+          <w:p>
+            <w:pPr>
+              <w:spacing w:before="0" w:after="60"/>
+              <w:keepNext/>
+              <w:jc w:val="center"/>
+            </w:pPr>
+            <w:r>
+              <w:rPr>
+                <w:rFonts w:ascii="Calibri" w:hAnsi="Calibri"/>
+                <w:sz w:val="20"/>
+              </w:rPr>
+              <w:t xml:space="default"/>
+            </w:r>
+          </w:p>
+        </w:tc>
+        <w:tc>
+          <w:tcPr>
+            <w:tcBorders>
+              <w:top w:val="single" w:space="0" w:color="D3D3D3"/>
+              <w:bottom w:val="single" w:space="0" w:color="D3D3D3"/>
+              <w:start w:val="single" w:space="0" w:color="D3D3D3"/>
+              <w:end w:val="single" w:space="0" w:color="D3D3D3"/>
+            </w:tcBorders>
+          </w:tcPr>
+          <w:p>
+            <w:pPr>
+              <w:spacing w:before="0" w:after="60"/>
+              <w:keepNext/>
+              <w:jc w:val="center"/>
+            </w:pPr>
+            <w:r>
+              <w:rPr>
+                <w:rFonts w:ascii="Calibri" w:hAnsi="Calibri"/>
+                <w:sz w:val="20"/>
+              </w:rPr>
+              <w:t xml:space="default"/>
+            </w:r>
+          </w:p>
+        </w:tc>
+        <w:tc>
+          <w:tcPr>
+            <w:tcBorders>
+              <w:top w:val="single" w:space="0" w:color="D3D3D3"/>
+              <w:bottom w:val="single" w:space="0" w:color="D3D3D3"/>
+              <w:start w:val="single" w:space="0" w:color="D3D3D3"/>
+              <w:end w:val="single" w:space="0" w:color="D3D3D3"/>
+            </w:tcBorders>
+          </w:tcPr>
+          <w:p>
+            <w:pPr>
+              <w:spacing w:before="0" w:after="60"/>
+              <w:keepNext/>
+              <w:jc w:val="center"/>
+            </w:pPr>
+            <w:r>
+              <w:rPr>
+                <w:rFonts w:ascii="Calibri" w:hAnsi="Calibri"/>
+                <w:sz w:val="20"/>
+              </w:rPr>
+              <w:t xml:space="default"/>
+            </w:r>
+          </w:p>
+        </w:tc>
+        <w:tc>
+          <w:tcPr>
+            <w:tcBorders>
+              <w:top w:val="single" w:space="0" w:color="D3D3D3"/>
+              <w:bottom w:val="single" w:space="0" w:color="D3D3D3"/>
+              <w:start w:val="single" w:space="0" w:color="D3D3D3"/>
+              <w:end w:val="single" w:space="0" w:color="D3D3D3"/>
+            </w:tcBorders>
+          </w:tcPr>
+          <w:p>
+            <w:pPr>
+              <w:spacing w:before="0" w:after="60"/>
+              <w:keepNext/>
+              <w:jc w:val="center"/>
+            </w:pPr>
+            <w:r>
+              <w:rPr>
+                <w:rFonts w:ascii="Calibri" w:hAnsi="Calibri"/>
+                <w:sz w:val="20"/>
+              </w:rPr>
+              <w:t xml:space="default"/>
+            </w:r>
+          </w:p>
+        </w:tc>
+        <w:tc>
+          <w:tcPr>
+            <w:tcBorders>
+              <w:top w:val="single" w:space="0" w:color="D3D3D3"/>
+              <w:bottom w:val="single" w:space="0" w:color="D3D3D3"/>
+              <w:start w:val="single" w:space="0" w:color="D3D3D3"/>
+              <w:end w:val="single" w:space="0" w:color="D3D3D3"/>
+            </w:tcBorders>
+          </w:tcPr>
+          <w:p>
+            <w:pPr>
+              <w:spacing w:before="0" w:after="60"/>
+              <w:keepNext/>
+              <w:jc w:val="center"/>
+            </w:pPr>
+            <w:r>
+              <w:rPr>
+                <w:rFonts w:ascii="Calibri" w:hAnsi="Calibri"/>
+                <w:sz w:val="20"/>
+              </w:rPr>
+              <w:t xml:space="default"/>
+            </w:r>
+          </w:p>
+        </w:tc>
+        <w:tc>
+          <w:tcPr>
+            <w:tcBorders>
+              <w:top w:val="single" w:space="0" w:color="D3D3D3"/>
+              <w:bottom w:val="single" w:space="0" w:color="D3D3D3"/>
+              <w:start w:val="single" w:space="0" w:color="D3D3D3"/>
+              <w:end w:val="single" w:space="0" w:color="D3D3D3"/>
+            </w:tcBorders>
+          </w:tcPr>
+          <w:p>
+            <w:pPr>
+              <w:spacing w:before="0" w:after="60"/>
+              <w:keepNext/>
+              <w:jc w:val="center"/>
+            </w:pPr>
+            <w:r>
+              <w:rPr>
+                <w:rFonts w:ascii="Calibri" w:hAnsi="Calibri"/>
+                <w:sz w:val="20"/>
+              </w:rPr>
+              <w:t xml:space="default"/>
+            </w:r>
+          </w:p>
+        </w:tc>
+        <w:tc>
+          <w:tcPr>
+            <w:tcBorders>
+              <w:top w:val="single" w:space="0" w:color="D3D3D3"/>
+              <w:bottom w:val="single" w:space="0" w:color="D3D3D3"/>
+              <w:start w:val="single" w:space="0" w:color="D3D3D3"/>
+              <w:end w:val="single" w:space="0" w:color="D3D3D3"/>
+            </w:tcBorders>
+          </w:tcPr>
+          <w:p>
+            <w:pPr>
+              <w:spacing w:before="0" w:after="60"/>
+              <w:keepNext/>
+              <w:jc w:val="center"/>
+            </w:pPr>
+            <w:r>
+              <w:rPr>
+                <w:rFonts w:ascii="Calibri" w:hAnsi="Calibri"/>
+                <w:sz w:val="20"/>
+              </w:rPr>
+              <w:t xml:space="default"/>
+            </w:r>
+          </w:p>
+        </w:tc>
+        <w:tc>
+          <w:tcPr>
+            <w:tcBorders>
+              <w:top w:val="single" w:space="0" w:color="D3D3D3"/>
+              <w:bottom w:val="single" w:space="0" w:color="D3D3D3"/>
+              <w:start w:val="single" w:space="0" w:color="D3D3D3"/>
+              <w:end w:val="single" w:space="0" w:color="D3D3D3"/>
+            </w:tcBorders>
+          </w:tcPr>
+          <w:p>
+            <w:pPr>
+              <w:spacing w:before="0" w:after="60"/>
+              <w:keepNext/>
+              <w:jc w:val="center"/>
+            </w:pPr>
+            <w:r>
+              <w:rPr>
+                <w:rFonts w:ascii="Calibri" w:hAnsi="Calibri"/>
+                <w:sz w:val="20"/>
+              </w:rPr>
+              <w:t xml:space="default"/>
             </w:r>
           </w:p>
         </w:tc>
@@ -4743,199 +4743,199 @@
                 <w:rFonts w:ascii="Calibri" w:hAnsi="Calibri"/>
                 <w:sz w:val="20"/>
               </w:rPr>
-              <w:t xml:space="default">    Low Food Security</w:t>
-            </w:r>
-          </w:p>
-        </w:tc>
-        <w:tc>
-          <w:tcPr>
-            <w:tcBorders>
-              <w:top w:val="single" w:space="0" w:color="D3D3D3"/>
-              <w:bottom w:val="single" w:space="0" w:color="D3D3D3"/>
-              <w:start w:val="single" w:space="0" w:color="D3D3D3"/>
-              <w:end w:val="single" w:space="0" w:color="D3D3D3"/>
-            </w:tcBorders>
-          </w:tcPr>
-          <w:p>
-            <w:pPr>
-              <w:spacing w:before="0" w:after="60"/>
-              <w:keepNext/>
-              <w:jc w:val="center"/>
-            </w:pPr>
-            <w:r>
-              <w:rPr>
-                <w:rFonts w:ascii="Calibri" w:hAnsi="Calibri"/>
-                <w:sz w:val="20"/>
-              </w:rPr>
-              <w:t xml:space="default">48 (8.8%)</w:t>
-            </w:r>
-          </w:p>
-        </w:tc>
-        <w:tc>
-          <w:tcPr>
-            <w:tcBorders>
-              <w:top w:val="single" w:space="0" w:color="D3D3D3"/>
-              <w:bottom w:val="single" w:space="0" w:color="D3D3D3"/>
-              <w:start w:val="single" w:space="0" w:color="D3D3D3"/>
-              <w:end w:val="single" w:space="0" w:color="D3D3D3"/>
-            </w:tcBorders>
-          </w:tcPr>
-          <w:p>
-            <w:pPr>
-              <w:spacing w:before="0" w:after="60"/>
-              <w:keepNext/>
-              <w:jc w:val="center"/>
-            </w:pPr>
-            <w:r>
-              <w:rPr>
-                <w:rFonts w:ascii="Calibri" w:hAnsi="Calibri"/>
-                <w:sz w:val="20"/>
-              </w:rPr>
-              <w:t xml:space="default">74 (9.6%)</w:t>
-            </w:r>
-          </w:p>
-        </w:tc>
-        <w:tc>
-          <w:tcPr>
-            <w:tcBorders>
-              <w:top w:val="single" w:space="0" w:color="D3D3D3"/>
-              <w:bottom w:val="single" w:space="0" w:color="D3D3D3"/>
-              <w:start w:val="single" w:space="0" w:color="D3D3D3"/>
-              <w:end w:val="single" w:space="0" w:color="D3D3D3"/>
-            </w:tcBorders>
-          </w:tcPr>
-          <w:p>
-            <w:pPr>
-              <w:spacing w:before="0" w:after="60"/>
-              <w:keepNext/>
-              <w:jc w:val="center"/>
-            </w:pPr>
-            <w:r>
-              <w:rPr>
-                <w:rFonts w:ascii="Calibri" w:hAnsi="Calibri"/>
-                <w:sz w:val="20"/>
-              </w:rPr>
-              <w:t xml:space="default">71 (9.0%)</w:t>
-            </w:r>
-          </w:p>
-        </w:tc>
-        <w:tc>
-          <w:tcPr>
-            <w:tcBorders>
-              <w:top w:val="single" w:space="0" w:color="D3D3D3"/>
-              <w:bottom w:val="single" w:space="0" w:color="D3D3D3"/>
-              <w:start w:val="single" w:space="0" w:color="D3D3D3"/>
-              <w:end w:val="single" w:space="0" w:color="D3D3D3"/>
-            </w:tcBorders>
-          </w:tcPr>
-          <w:p>
-            <w:pPr>
-              <w:spacing w:before="0" w:after="60"/>
-              <w:keepNext/>
-              <w:jc w:val="center"/>
-            </w:pPr>
-            <w:r>
-              <w:rPr>
-                <w:rFonts w:ascii="Calibri" w:hAnsi="Calibri"/>
-                <w:sz w:val="20"/>
-              </w:rPr>
-              <w:t xml:space="default">53 (12%)</w:t>
-            </w:r>
-          </w:p>
-        </w:tc>
-        <w:tc>
-          <w:tcPr>
-            <w:tcBorders>
-              <w:top w:val="single" w:space="0" w:color="D3D3D3"/>
-              <w:bottom w:val="single" w:space="0" w:color="D3D3D3"/>
-              <w:start w:val="single" w:space="0" w:color="D3D3D3"/>
-              <w:end w:val="single" w:space="0" w:color="D3D3D3"/>
-            </w:tcBorders>
-          </w:tcPr>
-          <w:p>
-            <w:pPr>
-              <w:spacing w:before="0" w:after="60"/>
-              <w:keepNext/>
-              <w:jc w:val="center"/>
-            </w:pPr>
-            <w:r>
-              <w:rPr>
-                <w:rFonts w:ascii="Calibri" w:hAnsi="Calibri"/>
-                <w:sz w:val="20"/>
-              </w:rPr>
-              <w:t xml:space="default">62 (9.0%)</w:t>
-            </w:r>
-          </w:p>
-        </w:tc>
-        <w:tc>
-          <w:tcPr>
-            <w:tcBorders>
-              <w:top w:val="single" w:space="0" w:color="D3D3D3"/>
-              <w:bottom w:val="single" w:space="0" w:color="D3D3D3"/>
-              <w:start w:val="single" w:space="0" w:color="D3D3D3"/>
-              <w:end w:val="single" w:space="0" w:color="D3D3D3"/>
-            </w:tcBorders>
-          </w:tcPr>
-          <w:p>
-            <w:pPr>
-              <w:spacing w:before="0" w:after="60"/>
-              <w:keepNext/>
-              <w:jc w:val="center"/>
-            </w:pPr>
-            <w:r>
-              <w:rPr>
-                <w:rFonts w:ascii="Calibri" w:hAnsi="Calibri"/>
-                <w:sz w:val="20"/>
-              </w:rPr>
-              <w:t xml:space="default">52 (8.4%)</w:t>
-            </w:r>
-          </w:p>
-        </w:tc>
-        <w:tc>
-          <w:tcPr>
-            <w:tcBorders>
-              <w:top w:val="single" w:space="0" w:color="D3D3D3"/>
-              <w:bottom w:val="single" w:space="0" w:color="D3D3D3"/>
-              <w:start w:val="single" w:space="0" w:color="D3D3D3"/>
-              <w:end w:val="single" w:space="0" w:color="D3D3D3"/>
-            </w:tcBorders>
-          </w:tcPr>
-          <w:p>
-            <w:pPr>
-              <w:spacing w:before="0" w:after="60"/>
-              <w:keepNext/>
-              <w:jc w:val="center"/>
-            </w:pPr>
-            <w:r>
-              <w:rPr>
-                <w:rFonts w:ascii="Calibri" w:hAnsi="Calibri"/>
-                <w:sz w:val="20"/>
-              </w:rPr>
-              <w:t xml:space="default">74 (11%)</w:t>
-            </w:r>
-          </w:p>
-        </w:tc>
-        <w:tc>
-          <w:tcPr>
-            <w:tcBorders>
-              <w:top w:val="single" w:space="0" w:color="D3D3D3"/>
-              <w:bottom w:val="single" w:space="0" w:color="D3D3D3"/>
-              <w:start w:val="single" w:space="0" w:color="D3D3D3"/>
-              <w:end w:val="single" w:space="0" w:color="D3D3D3"/>
-            </w:tcBorders>
-          </w:tcPr>
-          <w:p>
-            <w:pPr>
-              <w:spacing w:before="0" w:after="60"/>
-              <w:keepNext/>
-              <w:jc w:val="center"/>
-            </w:pPr>
-            <w:r>
-              <w:rPr>
-                <w:rFonts w:ascii="Calibri" w:hAnsi="Calibri"/>
-                <w:sz w:val="20"/>
-              </w:rPr>
-              <w:t xml:space="default">58 (13%)</w:t>
+              <w:t xml:space="default">    High/Marginal Food Security</w:t>
+            </w:r>
+          </w:p>
+        </w:tc>
+        <w:tc>
+          <w:tcPr>
+            <w:tcBorders>
+              <w:top w:val="single" w:space="0" w:color="D3D3D3"/>
+              <w:bottom w:val="single" w:space="0" w:color="D3D3D3"/>
+              <w:start w:val="single" w:space="0" w:color="D3D3D3"/>
+              <w:end w:val="single" w:space="0" w:color="D3D3D3"/>
+            </w:tcBorders>
+          </w:tcPr>
+          <w:p>
+            <w:pPr>
+              <w:spacing w:before="0" w:after="60"/>
+              <w:keepNext/>
+              <w:jc w:val="center"/>
+            </w:pPr>
+            <w:r>
+              <w:rPr>
+                <w:rFonts w:ascii="Calibri" w:hAnsi="Calibri"/>
+                <w:sz w:val="20"/>
+              </w:rPr>
+              <w:t xml:space="default">413 (90%)</w:t>
+            </w:r>
+          </w:p>
+        </w:tc>
+        <w:tc>
+          <w:tcPr>
+            <w:tcBorders>
+              <w:top w:val="single" w:space="0" w:color="D3D3D3"/>
+              <w:bottom w:val="single" w:space="0" w:color="D3D3D3"/>
+              <w:start w:val="single" w:space="0" w:color="D3D3D3"/>
+              <w:end w:val="single" w:space="0" w:color="D3D3D3"/>
+            </w:tcBorders>
+          </w:tcPr>
+          <w:p>
+            <w:pPr>
+              <w:spacing w:before="0" w:after="60"/>
+              <w:keepNext/>
+              <w:jc w:val="center"/>
+            </w:pPr>
+            <w:r>
+              <w:rPr>
+                <w:rFonts w:ascii="Calibri" w:hAnsi="Calibri"/>
+                <w:sz w:val="20"/>
+              </w:rPr>
+              <w:t xml:space="default">467 (89%)</w:t>
+            </w:r>
+          </w:p>
+        </w:tc>
+        <w:tc>
+          <w:tcPr>
+            <w:tcBorders>
+              <w:top w:val="single" w:space="0" w:color="D3D3D3"/>
+              <w:bottom w:val="single" w:space="0" w:color="D3D3D3"/>
+              <w:start w:val="single" w:space="0" w:color="D3D3D3"/>
+              <w:end w:val="single" w:space="0" w:color="D3D3D3"/>
+            </w:tcBorders>
+          </w:tcPr>
+          <w:p>
+            <w:pPr>
+              <w:spacing w:before="0" w:after="60"/>
+              <w:keepNext/>
+              <w:jc w:val="center"/>
+            </w:pPr>
+            <w:r>
+              <w:rPr>
+                <w:rFonts w:ascii="Calibri" w:hAnsi="Calibri"/>
+                <w:sz w:val="20"/>
+              </w:rPr>
+              <w:t xml:space="default">541 (89%)</w:t>
+            </w:r>
+          </w:p>
+        </w:tc>
+        <w:tc>
+          <w:tcPr>
+            <w:tcBorders>
+              <w:top w:val="single" w:space="0" w:color="D3D3D3"/>
+              <w:bottom w:val="single" w:space="0" w:color="D3D3D3"/>
+              <w:start w:val="single" w:space="0" w:color="D3D3D3"/>
+              <w:end w:val="single" w:space="0" w:color="D3D3D3"/>
+            </w:tcBorders>
+          </w:tcPr>
+          <w:p>
+            <w:pPr>
+              <w:spacing w:before="0" w:after="60"/>
+              <w:keepNext/>
+              <w:jc w:val="center"/>
+            </w:pPr>
+            <w:r>
+              <w:rPr>
+                <w:rFonts w:ascii="Calibri" w:hAnsi="Calibri"/>
+                <w:sz w:val="20"/>
+              </w:rPr>
+              <w:t xml:space="default">336 (86%)</w:t>
+            </w:r>
+          </w:p>
+        </w:tc>
+        <w:tc>
+          <w:tcPr>
+            <w:tcBorders>
+              <w:top w:val="single" w:space="0" w:color="D3D3D3"/>
+              <w:bottom w:val="single" w:space="0" w:color="D3D3D3"/>
+              <w:start w:val="single" w:space="0" w:color="D3D3D3"/>
+              <w:end w:val="single" w:space="0" w:color="D3D3D3"/>
+            </w:tcBorders>
+          </w:tcPr>
+          <w:p>
+            <w:pPr>
+              <w:spacing w:before="0" w:after="60"/>
+              <w:keepNext/>
+              <w:jc w:val="center"/>
+            </w:pPr>
+            <w:r>
+              <w:rPr>
+                <w:rFonts w:ascii="Calibri" w:hAnsi="Calibri"/>
+                <w:sz w:val="20"/>
+              </w:rPr>
+              <w:t xml:space="default">434 (89%)</w:t>
+            </w:r>
+          </w:p>
+        </w:tc>
+        <w:tc>
+          <w:tcPr>
+            <w:tcBorders>
+              <w:top w:val="single" w:space="0" w:color="D3D3D3"/>
+              <w:bottom w:val="single" w:space="0" w:color="D3D3D3"/>
+              <w:start w:val="single" w:space="0" w:color="D3D3D3"/>
+              <w:end w:val="single" w:space="0" w:color="D3D3D3"/>
+            </w:tcBorders>
+          </w:tcPr>
+          <w:p>
+            <w:pPr>
+              <w:spacing w:before="0" w:after="60"/>
+              <w:keepNext/>
+              <w:jc w:val="center"/>
+            </w:pPr>
+            <w:r>
+              <w:rPr>
+                <w:rFonts w:ascii="Calibri" w:hAnsi="Calibri"/>
+                <w:sz w:val="20"/>
+              </w:rPr>
+              <w:t xml:space="default">397 (90%)</w:t>
+            </w:r>
+          </w:p>
+        </w:tc>
+        <w:tc>
+          <w:tcPr>
+            <w:tcBorders>
+              <w:top w:val="single" w:space="0" w:color="D3D3D3"/>
+              <w:bottom w:val="single" w:space="0" w:color="D3D3D3"/>
+              <w:start w:val="single" w:space="0" w:color="D3D3D3"/>
+              <w:end w:val="single" w:space="0" w:color="D3D3D3"/>
+            </w:tcBorders>
+          </w:tcPr>
+          <w:p>
+            <w:pPr>
+              <w:spacing w:before="0" w:after="60"/>
+              <w:keepNext/>
+              <w:jc w:val="center"/>
+            </w:pPr>
+            <w:r>
+              <w:rPr>
+                <w:rFonts w:ascii="Calibri" w:hAnsi="Calibri"/>
+                <w:sz w:val="20"/>
+              </w:rPr>
+              <w:t xml:space="default">491 (88%)</w:t>
+            </w:r>
+          </w:p>
+        </w:tc>
+        <w:tc>
+          <w:tcPr>
+            <w:tcBorders>
+              <w:top w:val="single" w:space="0" w:color="D3D3D3"/>
+              <w:bottom w:val="single" w:space="0" w:color="D3D3D3"/>
+              <w:start w:val="single" w:space="0" w:color="D3D3D3"/>
+              <w:end w:val="single" w:space="0" w:color="D3D3D3"/>
+            </w:tcBorders>
+          </w:tcPr>
+          <w:p>
+            <w:pPr>
+              <w:spacing w:before="0" w:after="60"/>
+              <w:keepNext/>
+              <w:jc w:val="center"/>
+            </w:pPr>
+            <w:r>
+              <w:rPr>
+                <w:rFonts w:ascii="Calibri" w:hAnsi="Calibri"/>
+                <w:sz w:val="20"/>
+              </w:rPr>
+              <w:t xml:space="default">338 (83%)</w:t>
             </w:r>
           </w:p>
         </w:tc>
@@ -4964,199 +4964,199 @@
                 <w:rFonts w:ascii="Calibri" w:hAnsi="Calibri"/>
                 <w:sz w:val="20"/>
               </w:rPr>
-              <w:t xml:space="default">    Very Low Food Security</w:t>
-            </w:r>
-          </w:p>
-        </w:tc>
-        <w:tc>
-          <w:tcPr>
-            <w:tcBorders>
-              <w:top w:val="single" w:space="0" w:color="D3D3D3"/>
-              <w:bottom w:val="single" w:space="0" w:color="D3D3D3"/>
-              <w:start w:val="single" w:space="0" w:color="D3D3D3"/>
-              <w:end w:val="single" w:space="0" w:color="D3D3D3"/>
-            </w:tcBorders>
-          </w:tcPr>
-          <w:p>
-            <w:pPr>
-              <w:spacing w:before="0" w:after="60"/>
-              <w:keepNext/>
-              <w:jc w:val="center"/>
-            </w:pPr>
-            <w:r>
-              <w:rPr>
-                <w:rFonts w:ascii="Calibri" w:hAnsi="Calibri"/>
-                <w:sz w:val="20"/>
-              </w:rPr>
-              <w:t xml:space="default">6 (0.8%)</w:t>
-            </w:r>
-          </w:p>
-        </w:tc>
-        <w:tc>
-          <w:tcPr>
-            <w:tcBorders>
-              <w:top w:val="single" w:space="0" w:color="D3D3D3"/>
-              <w:bottom w:val="single" w:space="0" w:color="D3D3D3"/>
-              <w:start w:val="single" w:space="0" w:color="D3D3D3"/>
-              <w:end w:val="single" w:space="0" w:color="D3D3D3"/>
-            </w:tcBorders>
-          </w:tcPr>
-          <w:p>
-            <w:pPr>
-              <w:spacing w:before="0" w:after="60"/>
-              <w:keepNext/>
-              <w:jc w:val="center"/>
-            </w:pPr>
-            <w:r>
-              <w:rPr>
-                <w:rFonts w:ascii="Calibri" w:hAnsi="Calibri"/>
-                <w:sz w:val="20"/>
-              </w:rPr>
-              <w:t xml:space="default">11 (1.8%)</w:t>
-            </w:r>
-          </w:p>
-        </w:tc>
-        <w:tc>
-          <w:tcPr>
-            <w:tcBorders>
-              <w:top w:val="single" w:space="0" w:color="D3D3D3"/>
-              <w:bottom w:val="single" w:space="0" w:color="D3D3D3"/>
-              <w:start w:val="single" w:space="0" w:color="D3D3D3"/>
-              <w:end w:val="single" w:space="0" w:color="D3D3D3"/>
-            </w:tcBorders>
-          </w:tcPr>
-          <w:p>
-            <w:pPr>
-              <w:spacing w:before="0" w:after="60"/>
-              <w:keepNext/>
-              <w:jc w:val="center"/>
-            </w:pPr>
-            <w:r>
-              <w:rPr>
-                <w:rFonts w:ascii="Calibri" w:hAnsi="Calibri"/>
-                <w:sz w:val="20"/>
-              </w:rPr>
-              <w:t xml:space="default">11 (1.7%)</w:t>
-            </w:r>
-          </w:p>
-        </w:tc>
-        <w:tc>
-          <w:tcPr>
-            <w:tcBorders>
-              <w:top w:val="single" w:space="0" w:color="D3D3D3"/>
-              <w:bottom w:val="single" w:space="0" w:color="D3D3D3"/>
-              <w:start w:val="single" w:space="0" w:color="D3D3D3"/>
-              <w:end w:val="single" w:space="0" w:color="D3D3D3"/>
-            </w:tcBorders>
-          </w:tcPr>
-          <w:p>
-            <w:pPr>
-              <w:spacing w:before="0" w:after="60"/>
-              <w:keepNext/>
-              <w:jc w:val="center"/>
-            </w:pPr>
-            <w:r>
-              <w:rPr>
-                <w:rFonts w:ascii="Calibri" w:hAnsi="Calibri"/>
-                <w:sz w:val="20"/>
-              </w:rPr>
-              <w:t xml:space="default">13 (2.1%)</w:t>
-            </w:r>
-          </w:p>
-        </w:tc>
-        <w:tc>
-          <w:tcPr>
-            <w:tcBorders>
-              <w:top w:val="single" w:space="0" w:color="D3D3D3"/>
-              <w:bottom w:val="single" w:space="0" w:color="D3D3D3"/>
-              <w:start w:val="single" w:space="0" w:color="D3D3D3"/>
-              <w:end w:val="single" w:space="0" w:color="D3D3D3"/>
-            </w:tcBorders>
-          </w:tcPr>
-          <w:p>
-            <w:pPr>
-              <w:spacing w:before="0" w:after="60"/>
-              <w:keepNext/>
-              <w:jc w:val="center"/>
-            </w:pPr>
-            <w:r>
-              <w:rPr>
-                <w:rFonts w:ascii="Calibri" w:hAnsi="Calibri"/>
-                <w:sz w:val="20"/>
-              </w:rPr>
-              <w:t xml:space="default">15 (2.2%)</w:t>
-            </w:r>
-          </w:p>
-        </w:tc>
-        <w:tc>
-          <w:tcPr>
-            <w:tcBorders>
-              <w:top w:val="single" w:space="0" w:color="D3D3D3"/>
-              <w:bottom w:val="single" w:space="0" w:color="D3D3D3"/>
-              <w:start w:val="single" w:space="0" w:color="D3D3D3"/>
-              <w:end w:val="single" w:space="0" w:color="D3D3D3"/>
-            </w:tcBorders>
-          </w:tcPr>
-          <w:p>
-            <w:pPr>
-              <w:spacing w:before="0" w:after="60"/>
-              <w:keepNext/>
-              <w:jc w:val="center"/>
-            </w:pPr>
-            <w:r>
-              <w:rPr>
-                <w:rFonts w:ascii="Calibri" w:hAnsi="Calibri"/>
-                <w:sz w:val="20"/>
-              </w:rPr>
-              <w:t xml:space="default">8 (1.8%)</w:t>
-            </w:r>
-          </w:p>
-        </w:tc>
-        <w:tc>
-          <w:tcPr>
-            <w:tcBorders>
-              <w:top w:val="single" w:space="0" w:color="D3D3D3"/>
-              <w:bottom w:val="single" w:space="0" w:color="D3D3D3"/>
-              <w:start w:val="single" w:space="0" w:color="D3D3D3"/>
-              <w:end w:val="single" w:space="0" w:color="D3D3D3"/>
-            </w:tcBorders>
-          </w:tcPr>
-          <w:p>
-            <w:pPr>
-              <w:spacing w:before="0" w:after="60"/>
-              <w:keepNext/>
-              <w:jc w:val="center"/>
-            </w:pPr>
-            <w:r>
-              <w:rPr>
-                <w:rFonts w:ascii="Calibri" w:hAnsi="Calibri"/>
-                <w:sz w:val="20"/>
-              </w:rPr>
-              <w:t xml:space="default">12 (1.1%)</w:t>
-            </w:r>
-          </w:p>
-        </w:tc>
-        <w:tc>
-          <w:tcPr>
-            <w:tcBorders>
-              <w:top w:val="single" w:space="0" w:color="D3D3D3"/>
-              <w:bottom w:val="single" w:space="0" w:color="D3D3D3"/>
-              <w:start w:val="single" w:space="0" w:color="D3D3D3"/>
-              <w:end w:val="single" w:space="0" w:color="D3D3D3"/>
-            </w:tcBorders>
-          </w:tcPr>
-          <w:p>
-            <w:pPr>
-              <w:spacing w:before="0" w:after="60"/>
-              <w:keepNext/>
-              <w:jc w:val="center"/>
-            </w:pPr>
-            <w:r>
-              <w:rPr>
-                <w:rFonts w:ascii="Calibri" w:hAnsi="Calibri"/>
-                <w:sz w:val="20"/>
-              </w:rPr>
-              <w:t xml:space="default">12 (3.4%)</w:t>
+              <w:t xml:space="default">    Low/Very Low Food Security</w:t>
+            </w:r>
+          </w:p>
+        </w:tc>
+        <w:tc>
+          <w:tcPr>
+            <w:tcBorders>
+              <w:top w:val="single" w:space="0" w:color="D3D3D3"/>
+              <w:bottom w:val="single" w:space="0" w:color="D3D3D3"/>
+              <w:start w:val="single" w:space="0" w:color="D3D3D3"/>
+              <w:end w:val="single" w:space="0" w:color="D3D3D3"/>
+            </w:tcBorders>
+          </w:tcPr>
+          <w:p>
+            <w:pPr>
+              <w:spacing w:before="0" w:after="60"/>
+              <w:keepNext/>
+              <w:jc w:val="center"/>
+            </w:pPr>
+            <w:r>
+              <w:rPr>
+                <w:rFonts w:ascii="Calibri" w:hAnsi="Calibri"/>
+                <w:sz w:val="20"/>
+              </w:rPr>
+              <w:t xml:space="default">54 (9.5%)</w:t>
+            </w:r>
+          </w:p>
+        </w:tc>
+        <w:tc>
+          <w:tcPr>
+            <w:tcBorders>
+              <w:top w:val="single" w:space="0" w:color="D3D3D3"/>
+              <w:bottom w:val="single" w:space="0" w:color="D3D3D3"/>
+              <w:start w:val="single" w:space="0" w:color="D3D3D3"/>
+              <w:end w:val="single" w:space="0" w:color="D3D3D3"/>
+            </w:tcBorders>
+          </w:tcPr>
+          <w:p>
+            <w:pPr>
+              <w:spacing w:before="0" w:after="60"/>
+              <w:keepNext/>
+              <w:jc w:val="center"/>
+            </w:pPr>
+            <w:r>
+              <w:rPr>
+                <w:rFonts w:ascii="Calibri" w:hAnsi="Calibri"/>
+                <w:sz w:val="20"/>
+              </w:rPr>
+              <w:t xml:space="default">85 (11%)</w:t>
+            </w:r>
+          </w:p>
+        </w:tc>
+        <w:tc>
+          <w:tcPr>
+            <w:tcBorders>
+              <w:top w:val="single" w:space="0" w:color="D3D3D3"/>
+              <w:bottom w:val="single" w:space="0" w:color="D3D3D3"/>
+              <w:start w:val="single" w:space="0" w:color="D3D3D3"/>
+              <w:end w:val="single" w:space="0" w:color="D3D3D3"/>
+            </w:tcBorders>
+          </w:tcPr>
+          <w:p>
+            <w:pPr>
+              <w:spacing w:before="0" w:after="60"/>
+              <w:keepNext/>
+              <w:jc w:val="center"/>
+            </w:pPr>
+            <w:r>
+              <w:rPr>
+                <w:rFonts w:ascii="Calibri" w:hAnsi="Calibri"/>
+                <w:sz w:val="20"/>
+              </w:rPr>
+              <w:t xml:space="default">82 (11%)</w:t>
+            </w:r>
+          </w:p>
+        </w:tc>
+        <w:tc>
+          <w:tcPr>
+            <w:tcBorders>
+              <w:top w:val="single" w:space="0" w:color="D3D3D3"/>
+              <w:bottom w:val="single" w:space="0" w:color="D3D3D3"/>
+              <w:start w:val="single" w:space="0" w:color="D3D3D3"/>
+              <w:end w:val="single" w:space="0" w:color="D3D3D3"/>
+            </w:tcBorders>
+          </w:tcPr>
+          <w:p>
+            <w:pPr>
+              <w:spacing w:before="0" w:after="60"/>
+              <w:keepNext/>
+              <w:jc w:val="center"/>
+            </w:pPr>
+            <w:r>
+              <w:rPr>
+                <w:rFonts w:ascii="Calibri" w:hAnsi="Calibri"/>
+                <w:sz w:val="20"/>
+              </w:rPr>
+              <w:t xml:space="default">66 (14%)</w:t>
+            </w:r>
+          </w:p>
+        </w:tc>
+        <w:tc>
+          <w:tcPr>
+            <w:tcBorders>
+              <w:top w:val="single" w:space="0" w:color="D3D3D3"/>
+              <w:bottom w:val="single" w:space="0" w:color="D3D3D3"/>
+              <w:start w:val="single" w:space="0" w:color="D3D3D3"/>
+              <w:end w:val="single" w:space="0" w:color="D3D3D3"/>
+            </w:tcBorders>
+          </w:tcPr>
+          <w:p>
+            <w:pPr>
+              <w:spacing w:before="0" w:after="60"/>
+              <w:keepNext/>
+              <w:jc w:val="center"/>
+            </w:pPr>
+            <w:r>
+              <w:rPr>
+                <w:rFonts w:ascii="Calibri" w:hAnsi="Calibri"/>
+                <w:sz w:val="20"/>
+              </w:rPr>
+              <w:t xml:space="default">77 (11%)</w:t>
+            </w:r>
+          </w:p>
+        </w:tc>
+        <w:tc>
+          <w:tcPr>
+            <w:tcBorders>
+              <w:top w:val="single" w:space="0" w:color="D3D3D3"/>
+              <w:bottom w:val="single" w:space="0" w:color="D3D3D3"/>
+              <w:start w:val="single" w:space="0" w:color="D3D3D3"/>
+              <w:end w:val="single" w:space="0" w:color="D3D3D3"/>
+            </w:tcBorders>
+          </w:tcPr>
+          <w:p>
+            <w:pPr>
+              <w:spacing w:before="0" w:after="60"/>
+              <w:keepNext/>
+              <w:jc w:val="center"/>
+            </w:pPr>
+            <w:r>
+              <w:rPr>
+                <w:rFonts w:ascii="Calibri" w:hAnsi="Calibri"/>
+                <w:sz w:val="20"/>
+              </w:rPr>
+              <w:t xml:space="default">60 (10%)</w:t>
+            </w:r>
+          </w:p>
+        </w:tc>
+        <w:tc>
+          <w:tcPr>
+            <w:tcBorders>
+              <w:top w:val="single" w:space="0" w:color="D3D3D3"/>
+              <w:bottom w:val="single" w:space="0" w:color="D3D3D3"/>
+              <w:start w:val="single" w:space="0" w:color="D3D3D3"/>
+              <w:end w:val="single" w:space="0" w:color="D3D3D3"/>
+            </w:tcBorders>
+          </w:tcPr>
+          <w:p>
+            <w:pPr>
+              <w:spacing w:before="0" w:after="60"/>
+              <w:keepNext/>
+              <w:jc w:val="center"/>
+            </w:pPr>
+            <w:r>
+              <w:rPr>
+                <w:rFonts w:ascii="Calibri" w:hAnsi="Calibri"/>
+                <w:sz w:val="20"/>
+              </w:rPr>
+              <w:t xml:space="default">86 (12%)</w:t>
+            </w:r>
+          </w:p>
+        </w:tc>
+        <w:tc>
+          <w:tcPr>
+            <w:tcBorders>
+              <w:top w:val="single" w:space="0" w:color="D3D3D3"/>
+              <w:bottom w:val="single" w:space="0" w:color="D3D3D3"/>
+              <w:start w:val="single" w:space="0" w:color="D3D3D3"/>
+              <w:end w:val="single" w:space="0" w:color="D3D3D3"/>
+            </w:tcBorders>
+          </w:tcPr>
+          <w:p>
+            <w:pPr>
+              <w:spacing w:before="0" w:after="60"/>
+              <w:keepNext/>
+              <w:jc w:val="center"/>
+            </w:pPr>
+            <w:r>
+              <w:rPr>
+                <w:rFonts w:ascii="Calibri" w:hAnsi="Calibri"/>
+                <w:sz w:val="20"/>
+              </w:rPr>
+              <w:t xml:space="default">70 (17%)</w:t>
             </w:r>
           </w:p>
         </w:tc>

</xml_diff>

<commit_message>
updates to table 1 and A1
</commit_message>
<xml_diff>
--- a/Code/Table1_Combined.docx
+++ b/Code/Table1_Combined.docx
@@ -6041,6 +6041,227 @@
                 <w:sz w:val="20"/>
               </w:rPr>
               <w:t xml:space="default">70 (16.7%)</w:t>
+            </w:r>
+          </w:p>
+        </w:tc>
+      </w:tr>
+      <w:tr>
+        <w:trPr>
+          <w:cantSplit/>
+        </w:trPr>
+        <w:tc>
+          <w:tcPr>
+            <w:tcBorders>
+              <w:top w:val="single" w:space="0" w:color="D3D3D3"/>
+              <w:bottom w:val="single" w:space="0" w:color="D3D3D3"/>
+              <w:start w:val="single" w:space="0" w:color="D3D3D3"/>
+              <w:end w:val="single" w:space="0" w:color="D3D3D3"/>
+            </w:tcBorders>
+          </w:tcPr>
+          <w:p>
+            <w:pPr>
+              <w:spacing w:before="0" w:after="60"/>
+              <w:keepNext/>
+              <w:jc w:val="start"/>
+            </w:pPr>
+            <w:r>
+              <w:rPr>
+                <w:rFonts w:ascii="Calibri" w:hAnsi="Calibri"/>
+                <w:sz w:val="20"/>
+              </w:rPr>
+              <w:t xml:space="default">Days Physically Active</w:t>
+            </w:r>
+          </w:p>
+        </w:tc>
+        <w:tc>
+          <w:tcPr>
+            <w:tcBorders>
+              <w:top w:val="single" w:space="0" w:color="D3D3D3"/>
+              <w:bottom w:val="single" w:space="0" w:color="D3D3D3"/>
+              <w:start w:val="single" w:space="0" w:color="D3D3D3"/>
+              <w:end w:val="single" w:space="0" w:color="D3D3D3"/>
+            </w:tcBorders>
+          </w:tcPr>
+          <w:p>
+            <w:pPr>
+              <w:spacing w:before="0" w:after="60"/>
+              <w:keepNext/>
+              <w:jc w:val="center"/>
+            </w:pPr>
+            <w:r>
+              <w:rPr>
+                <w:rFonts w:ascii="Calibri" w:hAnsi="Calibri"/>
+                <w:sz w:val="20"/>
+              </w:rPr>
+              <w:t xml:space="default">5.64 (0.18)</w:t>
+            </w:r>
+          </w:p>
+        </w:tc>
+        <w:tc>
+          <w:tcPr>
+            <w:tcBorders>
+              <w:top w:val="single" w:space="0" w:color="D3D3D3"/>
+              <w:bottom w:val="single" w:space="0" w:color="D3D3D3"/>
+              <w:start w:val="single" w:space="0" w:color="D3D3D3"/>
+              <w:end w:val="single" w:space="0" w:color="D3D3D3"/>
+            </w:tcBorders>
+          </w:tcPr>
+          <w:p>
+            <w:pPr>
+              <w:spacing w:before="0" w:after="60"/>
+              <w:keepNext/>
+              <w:jc w:val="center"/>
+            </w:pPr>
+            <w:r>
+              <w:rPr>
+                <w:rFonts w:ascii="Calibri" w:hAnsi="Calibri"/>
+                <w:sz w:val="20"/>
+              </w:rPr>
+              <w:t xml:space="default">5.40 (0.17)</w:t>
+            </w:r>
+          </w:p>
+        </w:tc>
+        <w:tc>
+          <w:tcPr>
+            <w:tcBorders>
+              <w:top w:val="single" w:space="0" w:color="D3D3D3"/>
+              <w:bottom w:val="single" w:space="0" w:color="D3D3D3"/>
+              <w:start w:val="single" w:space="0" w:color="D3D3D3"/>
+              <w:end w:val="single" w:space="0" w:color="D3D3D3"/>
+            </w:tcBorders>
+          </w:tcPr>
+          <w:p>
+            <w:pPr>
+              <w:spacing w:before="0" w:after="60"/>
+              <w:keepNext/>
+              <w:jc w:val="center"/>
+            </w:pPr>
+            <w:r>
+              <w:rPr>
+                <w:rFonts w:ascii="Calibri" w:hAnsi="Calibri"/>
+                <w:sz w:val="20"/>
+              </w:rPr>
+              <w:t xml:space="default">4.57 (0.19)</w:t>
+            </w:r>
+          </w:p>
+        </w:tc>
+        <w:tc>
+          <w:tcPr>
+            <w:tcBorders>
+              <w:top w:val="single" w:space="0" w:color="D3D3D3"/>
+              <w:bottom w:val="single" w:space="0" w:color="D3D3D3"/>
+              <w:start w:val="single" w:space="0" w:color="D3D3D3"/>
+              <w:end w:val="single" w:space="0" w:color="D3D3D3"/>
+            </w:tcBorders>
+          </w:tcPr>
+          <w:p>
+            <w:pPr>
+              <w:spacing w:before="0" w:after="60"/>
+              <w:keepNext/>
+              <w:jc w:val="center"/>
+            </w:pPr>
+            <w:r>
+              <w:rPr>
+                <w:rFonts w:ascii="Calibri" w:hAnsi="Calibri"/>
+                <w:sz w:val="20"/>
+              </w:rPr>
+              <w:t xml:space="default">4.57 (0.16)</w:t>
+            </w:r>
+          </w:p>
+        </w:tc>
+        <w:tc>
+          <w:tcPr>
+            <w:tcBorders>
+              <w:top w:val="single" w:space="0" w:color="D3D3D3"/>
+              <w:bottom w:val="single" w:space="0" w:color="D3D3D3"/>
+              <w:start w:val="single" w:space="0" w:color="D3D3D3"/>
+              <w:end w:val="single" w:space="0" w:color="D3D3D3"/>
+            </w:tcBorders>
+          </w:tcPr>
+          <w:p>
+            <w:pPr>
+              <w:spacing w:before="0" w:after="60"/>
+              <w:keepNext/>
+              <w:jc w:val="center"/>
+            </w:pPr>
+            <w:r>
+              <w:rPr>
+                <w:rFonts w:ascii="Calibri" w:hAnsi="Calibri"/>
+                <w:sz w:val="20"/>
+              </w:rPr>
+              <w:t xml:space="default">5.21 (0.16)</w:t>
+            </w:r>
+          </w:p>
+        </w:tc>
+        <w:tc>
+          <w:tcPr>
+            <w:tcBorders>
+              <w:top w:val="single" w:space="0" w:color="D3D3D3"/>
+              <w:bottom w:val="single" w:space="0" w:color="D3D3D3"/>
+              <w:start w:val="single" w:space="0" w:color="D3D3D3"/>
+              <w:end w:val="single" w:space="0" w:color="D3D3D3"/>
+            </w:tcBorders>
+          </w:tcPr>
+          <w:p>
+            <w:pPr>
+              <w:spacing w:before="0" w:after="60"/>
+              <w:keepNext/>
+              <w:jc w:val="center"/>
+            </w:pPr>
+            <w:r>
+              <w:rPr>
+                <w:rFonts w:ascii="Calibri" w:hAnsi="Calibri"/>
+                <w:sz w:val="20"/>
+              </w:rPr>
+              <w:t xml:space="default">4.80 (0.13)</w:t>
+            </w:r>
+          </w:p>
+        </w:tc>
+        <w:tc>
+          <w:tcPr>
+            <w:tcBorders>
+              <w:top w:val="single" w:space="0" w:color="D3D3D3"/>
+              <w:bottom w:val="single" w:space="0" w:color="D3D3D3"/>
+              <w:start w:val="single" w:space="0" w:color="D3D3D3"/>
+              <w:end w:val="single" w:space="0" w:color="D3D3D3"/>
+            </w:tcBorders>
+          </w:tcPr>
+          <w:p>
+            <w:pPr>
+              <w:spacing w:before="0" w:after="60"/>
+              <w:keepNext/>
+              <w:jc w:val="center"/>
+            </w:pPr>
+            <w:r>
+              <w:rPr>
+                <w:rFonts w:ascii="Calibri" w:hAnsi="Calibri"/>
+                <w:sz w:val="20"/>
+              </w:rPr>
+              <w:t xml:space="default">4.27 (0.12)</w:t>
+            </w:r>
+          </w:p>
+        </w:tc>
+        <w:tc>
+          <w:tcPr>
+            <w:tcBorders>
+              <w:top w:val="single" w:space="0" w:color="D3D3D3"/>
+              <w:bottom w:val="single" w:space="0" w:color="D3D3D3"/>
+              <w:start w:val="single" w:space="0" w:color="D3D3D3"/>
+              <w:end w:val="single" w:space="0" w:color="D3D3D3"/>
+            </w:tcBorders>
+          </w:tcPr>
+          <w:p>
+            <w:pPr>
+              <w:spacing w:before="0" w:after="60"/>
+              <w:keepNext/>
+              <w:jc w:val="center"/>
+            </w:pPr>
+            <w:r>
+              <w:rPr>
+                <w:rFonts w:ascii="Calibri" w:hAnsi="Calibri"/>
+                <w:sz w:val="20"/>
+              </w:rPr>
+              <w:t xml:space="default">3.91 (0.12)</w:t>
             </w:r>
           </w:p>
         </w:tc>

</xml_diff>